<commit_message>
Update logbook and project documentation for Week 7
</commit_message>
<xml_diff>
--- a/Logbook.docx
+++ b/Logbook.docx
@@ -8277,9 +8277,8 @@
       <w:pPr>
         <w:pStyle w:val="Heading1"/>
         <w:rPr>
-          <w:rFonts w:ascii="Times New Roman" w:hAnsi="Times New Roman" w:cs="Times New Roman"/>
-          <w:b w:val="0"/>
-          <w:bCs w:val="0"/>
+          <w:rFonts w:ascii="Times New Roman" w:eastAsia="MS Mincho" w:hAnsi="Times New Roman" w:cs="Times New Roman"/>
+          <w:color w:val="auto"/>
           <w:sz w:val="24"/>
           <w:szCs w:val="24"/>
         </w:rPr>
@@ -8312,361 +8311,1951 @@
         </w:rPr>
         <w:t> </w:t>
       </w:r>
-      <w:r>
-        <w:rPr>
-          <w:rFonts w:ascii="Times New Roman" w:eastAsia="MS Mincho" w:hAnsi="Times New Roman" w:cs="Times New Roman"/>
-          <w:color w:val="auto"/>
-          <w:sz w:val="24"/>
-          <w:szCs w:val="24"/>
-        </w:rPr>
-        <w:t>Data Management + Security Fixes</w:t>
-      </w:r>
       <w:bookmarkEnd w:id="26"/>
     </w:p>
     <w:p>
       <w:pPr>
         <w:rPr>
-          <w:rFonts w:ascii="Times New Roman" w:hAnsi="Times New Roman" w:cs="Times New Roman"/>
           <w:b/>
           <w:bCs/>
-          <w:sz w:val="24"/>
-          <w:szCs w:val="24"/>
-        </w:rPr>
-      </w:pPr>
-      <w:r>
-        <w:rPr>
-          <w:rFonts w:ascii="Times New Roman" w:hAnsi="Times New Roman" w:cs="Times New Roman"/>
+        </w:rPr>
+      </w:pPr>
+      <w:r>
+        <w:rPr>
           <w:b/>
           <w:bCs/>
-          <w:sz w:val="24"/>
-          <w:szCs w:val="24"/>
-        </w:rPr>
-        <w:t xml:space="preserve">Fixed few issues since I </w:t>
-      </w:r>
-      <w:proofErr w:type="spellStart"/>
-      <w:r>
-        <w:rPr>
-          <w:rFonts w:ascii="Times New Roman" w:hAnsi="Times New Roman" w:cs="Times New Roman"/>
+        </w:rPr>
+        <w:t>Task 1: Mobile Application Networking Analysis</w:t>
+      </w:r>
+    </w:p>
+    <w:p>
+      <w:pPr>
+        <w:rPr>
           <w:b/>
           <w:bCs/>
-          <w:sz w:val="24"/>
-          <w:szCs w:val="24"/>
-        </w:rPr>
-        <w:t>aready</w:t>
-      </w:r>
-      <w:proofErr w:type="spellEnd"/>
-      <w:r>
-        <w:rPr>
-          <w:rFonts w:ascii="Times New Roman" w:hAnsi="Times New Roman" w:cs="Times New Roman"/>
+        </w:rPr>
+      </w:pPr>
+    </w:p>
+    <w:p>
+      <w:pPr>
+        <w:rPr>
           <w:b/>
           <w:bCs/>
-          <w:sz w:val="24"/>
-          <w:szCs w:val="24"/>
-        </w:rPr>
-        <w:t xml:space="preserve"> worked on database week </w:t>
-      </w:r>
-      <w:proofErr w:type="gramStart"/>
-      <w:r>
-        <w:rPr>
-          <w:rFonts w:ascii="Times New Roman" w:hAnsi="Times New Roman" w:cs="Times New Roman"/>
+        </w:rPr>
+      </w:pPr>
+    </w:p>
+    <w:p>
+      <w:pPr>
+        <w:rPr>
           <w:b/>
           <w:bCs/>
-          <w:sz w:val="24"/>
-          <w:szCs w:val="24"/>
-        </w:rPr>
-        <w:t>4,so</w:t>
-      </w:r>
-      <w:proofErr w:type="gramEnd"/>
-      <w:r>
-        <w:rPr>
-          <w:rFonts w:ascii="Times New Roman" w:hAnsi="Times New Roman" w:cs="Times New Roman"/>
+        </w:rPr>
+      </w:pPr>
+    </w:p>
+    <w:p>
+      <w:pPr>
+        <w:rPr>
           <w:b/>
           <w:bCs/>
-          <w:sz w:val="24"/>
-          <w:szCs w:val="24"/>
-        </w:rPr>
-        <w:t xml:space="preserve"> for week 6 I ensured that only registered users can access the app</w:t>
-      </w:r>
-    </w:p>
-    <w:p>
-      <w:pPr>
-        <w:pStyle w:val="Heading2"/>
-        <w:rPr>
-          <w:rFonts w:ascii="Times New Roman" w:hAnsi="Times New Roman" w:cs="Times New Roman"/>
-          <w:b w:val="0"/>
-          <w:bCs w:val="0"/>
-          <w:color w:val="auto"/>
-          <w:sz w:val="24"/>
-          <w:szCs w:val="24"/>
-        </w:rPr>
-      </w:pPr>
-      <w:bookmarkStart w:id="27" w:name="_Toc232520334"/>
-      <w:r>
-        <w:rPr>
-          <w:rFonts w:ascii="Times New Roman" w:hAnsi="Times New Roman" w:cs="Times New Roman"/>
-          <w:color w:val="auto"/>
-          <w:sz w:val="24"/>
-          <w:szCs w:val="24"/>
-        </w:rPr>
-        <w:t>Login validation error</w:t>
-      </w:r>
-      <w:bookmarkEnd w:id="27"/>
-    </w:p>
-    <w:p>
-      <w:pPr>
-        <w:rPr>
-          <w:rFonts w:ascii="Times New Roman" w:hAnsi="Times New Roman" w:cs="Times New Roman"/>
-          <w:sz w:val="24"/>
-          <w:szCs w:val="24"/>
-        </w:rPr>
-      </w:pPr>
-    </w:p>
-    <w:p>
-      <w:pPr>
-        <w:rPr>
-          <w:rFonts w:ascii="Times New Roman" w:hAnsi="Times New Roman" w:cs="Times New Roman"/>
-          <w:sz w:val="24"/>
-          <w:szCs w:val="24"/>
-        </w:rPr>
-      </w:pPr>
-      <w:r>
-        <w:rPr>
-          <w:rFonts w:ascii="Times New Roman" w:hAnsi="Times New Roman" w:cs="Times New Roman"/>
-          <w:sz w:val="24"/>
-          <w:szCs w:val="24"/>
-        </w:rPr>
-        <w:lastRenderedPageBreak/>
-        <w:drawing>
-          <wp:inline distT="0" distB="0" distL="0" distR="0" wp14:anchorId="16702A24" wp14:editId="680D5CCD">
-            <wp:extent cx="2502029" cy="4597636"/>
-            <wp:effectExtent l="0" t="0" r="0" b="0"/>
-            <wp:docPr id="1363467434" name="Picture 1"/>
-            <wp:cNvGraphicFramePr>
-              <a:graphicFrameLocks xmlns:a="http://schemas.openxmlformats.org/drawingml/2006/main" noChangeAspect="1"/>
-            </wp:cNvGraphicFramePr>
-            <a:graphic xmlns:a="http://schemas.openxmlformats.org/drawingml/2006/main">
-              <a:graphicData uri="http://schemas.openxmlformats.org/drawingml/2006/picture">
-                <pic:pic xmlns:pic="http://schemas.openxmlformats.org/drawingml/2006/picture">
-                  <pic:nvPicPr>
-                    <pic:cNvPr id="1363467434" name=""/>
-                    <pic:cNvPicPr/>
-                  </pic:nvPicPr>
-                  <pic:blipFill>
-                    <a:blip r:embed="rId45"/>
-                    <a:stretch>
-                      <a:fillRect/>
-                    </a:stretch>
-                  </pic:blipFill>
-                  <pic:spPr>
-                    <a:xfrm>
-                      <a:off x="0" y="0"/>
-                      <a:ext cx="2502029" cy="4597636"/>
-                    </a:xfrm>
-                    <a:prstGeom prst="rect">
-                      <a:avLst/>
-                    </a:prstGeom>
-                  </pic:spPr>
-                </pic:pic>
-              </a:graphicData>
-            </a:graphic>
-          </wp:inline>
-        </w:drawing>
-      </w:r>
-    </w:p>
-    <w:p>
-      <w:pPr>
-        <w:rPr>
-          <w:rFonts w:ascii="Times New Roman" w:hAnsi="Times New Roman" w:cs="Times New Roman"/>
-          <w:sz w:val="24"/>
-          <w:szCs w:val="24"/>
-        </w:rPr>
-      </w:pPr>
-    </w:p>
-    <w:p>
-      <w:pPr>
-        <w:rPr>
-          <w:rFonts w:ascii="Times New Roman" w:hAnsi="Times New Roman" w:cs="Times New Roman"/>
-          <w:sz w:val="24"/>
-          <w:szCs w:val="24"/>
-        </w:rPr>
-      </w:pPr>
-    </w:p>
-    <w:p>
-      <w:pPr>
-        <w:pStyle w:val="Heading1"/>
-        <w:rPr>
-          <w:rFonts w:ascii="Times New Roman" w:hAnsi="Times New Roman" w:cs="Times New Roman"/>
-          <w:sz w:val="24"/>
-          <w:szCs w:val="24"/>
-        </w:rPr>
-      </w:pPr>
-    </w:p>
-    <w:p>
-      <w:pPr>
-        <w:rPr>
-          <w:rFonts w:ascii="Times New Roman" w:hAnsi="Times New Roman" w:cs="Times New Roman"/>
-          <w:sz w:val="24"/>
-          <w:szCs w:val="24"/>
-        </w:rPr>
-      </w:pPr>
-    </w:p>
-    <w:p>
-      <w:pPr>
-        <w:rPr>
-          <w:rFonts w:ascii="Times New Roman" w:hAnsi="Times New Roman" w:cs="Times New Roman"/>
-          <w:sz w:val="24"/>
-          <w:szCs w:val="24"/>
-        </w:rPr>
-      </w:pPr>
-      <w:r>
-        <w:rPr>
-          <w:rFonts w:ascii="Times New Roman" w:hAnsi="Times New Roman" w:cs="Times New Roman"/>
-          <w:sz w:val="24"/>
-          <w:szCs w:val="24"/>
-        </w:rPr>
-        <w:lastRenderedPageBreak/>
-        <w:drawing>
-          <wp:inline distT="0" distB="0" distL="0" distR="0" wp14:anchorId="0827DF13" wp14:editId="7CA5A2A2">
-            <wp:extent cx="2502029" cy="4597636"/>
-            <wp:effectExtent l="0" t="0" r="0" b="0"/>
-            <wp:docPr id="406301640" name="Picture 1"/>
-            <wp:cNvGraphicFramePr>
-              <a:graphicFrameLocks xmlns:a="http://schemas.openxmlformats.org/drawingml/2006/main" noChangeAspect="1"/>
-            </wp:cNvGraphicFramePr>
-            <a:graphic xmlns:a="http://schemas.openxmlformats.org/drawingml/2006/main">
-              <a:graphicData uri="http://schemas.openxmlformats.org/drawingml/2006/picture">
-                <pic:pic xmlns:pic="http://schemas.openxmlformats.org/drawingml/2006/picture">
-                  <pic:nvPicPr>
-                    <pic:cNvPr id="406301640" name=""/>
-                    <pic:cNvPicPr/>
-                  </pic:nvPicPr>
-                  <pic:blipFill>
-                    <a:blip r:embed="rId45"/>
-                    <a:stretch>
-                      <a:fillRect/>
-                    </a:stretch>
-                  </pic:blipFill>
-                  <pic:spPr>
-                    <a:xfrm>
-                      <a:off x="0" y="0"/>
-                      <a:ext cx="2502029" cy="4597636"/>
-                    </a:xfrm>
-                    <a:prstGeom prst="rect">
-                      <a:avLst/>
-                    </a:prstGeom>
-                  </pic:spPr>
-                </pic:pic>
-              </a:graphicData>
-            </a:graphic>
-          </wp:inline>
-        </w:drawing>
-      </w:r>
-    </w:p>
-    <w:p>
-      <w:pPr>
-        <w:rPr>
-          <w:rFonts w:ascii="Times New Roman" w:hAnsi="Times New Roman" w:cs="Times New Roman"/>
-          <w:sz w:val="24"/>
-          <w:szCs w:val="24"/>
-        </w:rPr>
-      </w:pPr>
-      <w:r>
-        <w:rPr>
-          <w:rFonts w:ascii="Times New Roman" w:hAnsi="Times New Roman" w:cs="Times New Roman"/>
+        </w:rPr>
+      </w:pPr>
+    </w:p>
+    <w:tbl>
+      <w:tblPr>
+        <w:tblW w:w="0" w:type="auto"/>
+        <w:tblCellSpacing w:w="15" w:type="dxa"/>
+        <w:tblBorders>
+          <w:top w:val="single" w:sz="4" w:space="0" w:color="auto"/>
+          <w:left w:val="single" w:sz="4" w:space="0" w:color="auto"/>
+          <w:bottom w:val="single" w:sz="4" w:space="0" w:color="auto"/>
+          <w:right w:val="single" w:sz="4" w:space="0" w:color="auto"/>
+          <w:insideH w:val="single" w:sz="4" w:space="0" w:color="auto"/>
+          <w:insideV w:val="single" w:sz="4" w:space="0" w:color="auto"/>
+        </w:tblBorders>
+        <w:tblCellMar>
+          <w:top w:w="15" w:type="dxa"/>
+          <w:left w:w="15" w:type="dxa"/>
+          <w:bottom w:w="15" w:type="dxa"/>
+          <w:right w:w="15" w:type="dxa"/>
+        </w:tblCellMar>
+        <w:tblLook w:val="04A0" w:firstRow="1" w:lastRow="0" w:firstColumn="1" w:lastColumn="0" w:noHBand="0" w:noVBand="1"/>
+      </w:tblPr>
+      <w:tblGrid>
+        <w:gridCol w:w="1268"/>
+        <w:gridCol w:w="1863"/>
+        <w:gridCol w:w="1604"/>
+        <w:gridCol w:w="3895"/>
+      </w:tblGrid>
+      <w:tr>
+        <w:trPr>
+          <w:tblHeader/>
+          <w:tblCellSpacing w:w="15" w:type="dxa"/>
+        </w:trPr>
+        <w:tc>
+          <w:tcPr>
+            <w:tcW w:w="0" w:type="auto"/>
+            <w:vAlign w:val="center"/>
+            <w:hideMark/>
+          </w:tcPr>
+          <w:p>
+            <w:pPr>
+              <w:rPr>
+                <w:b/>
+                <w:bCs/>
+              </w:rPr>
+            </w:pPr>
+            <w:r>
+              <w:rPr>
+                <w:b/>
+                <w:bCs/>
+              </w:rPr>
+              <w:lastRenderedPageBreak/>
+              <w:t>Application</w:t>
+            </w:r>
+          </w:p>
+        </w:tc>
+        <w:tc>
+          <w:tcPr>
+            <w:tcW w:w="0" w:type="auto"/>
+            <w:vAlign w:val="center"/>
+            <w:hideMark/>
+          </w:tcPr>
+          <w:p>
+            <w:pPr>
+              <w:rPr>
+                <w:b/>
+                <w:bCs/>
+              </w:rPr>
+            </w:pPr>
+            <w:r>
+              <w:rPr>
+                <w:b/>
+                <w:bCs/>
+              </w:rPr>
+              <w:t>Client</w:t>
+            </w:r>
+          </w:p>
+        </w:tc>
+        <w:tc>
+          <w:tcPr>
+            <w:tcW w:w="0" w:type="auto"/>
+            <w:vAlign w:val="center"/>
+            <w:hideMark/>
+          </w:tcPr>
+          <w:p>
+            <w:pPr>
+              <w:rPr>
+                <w:b/>
+                <w:bCs/>
+              </w:rPr>
+            </w:pPr>
+            <w:r>
+              <w:rPr>
+                <w:b/>
+                <w:bCs/>
+              </w:rPr>
+              <w:t>Server</w:t>
+            </w:r>
+          </w:p>
+        </w:tc>
+        <w:tc>
+          <w:tcPr>
+            <w:tcW w:w="0" w:type="auto"/>
+            <w:vAlign w:val="center"/>
+            <w:hideMark/>
+          </w:tcPr>
+          <w:p>
+            <w:pPr>
+              <w:rPr>
+                <w:b/>
+                <w:bCs/>
+              </w:rPr>
+            </w:pPr>
+            <w:r>
+              <w:rPr>
+                <w:b/>
+                <w:bCs/>
+              </w:rPr>
+              <w:t>Data Exchanged</w:t>
+            </w:r>
+          </w:p>
+        </w:tc>
+      </w:tr>
+      <w:tr>
+        <w:trPr>
+          <w:tblCellSpacing w:w="15" w:type="dxa"/>
+        </w:trPr>
+        <w:tc>
+          <w:tcPr>
+            <w:tcW w:w="0" w:type="auto"/>
+            <w:vAlign w:val="center"/>
+            <w:hideMark/>
+          </w:tcPr>
+          <w:p>
+            <w:r>
+              <w:t>WhatsApp</w:t>
+            </w:r>
+          </w:p>
+        </w:tc>
+        <w:tc>
+          <w:tcPr>
+            <w:tcW w:w="0" w:type="auto"/>
+            <w:vAlign w:val="center"/>
+            <w:hideMark/>
+          </w:tcPr>
+          <w:p>
+            <w:r>
+              <w:t>WhatsApp Mobile App</w:t>
+            </w:r>
+          </w:p>
+        </w:tc>
+        <w:tc>
+          <w:tcPr>
+            <w:tcW w:w="0" w:type="auto"/>
+            <w:vAlign w:val="center"/>
+            <w:hideMark/>
+          </w:tcPr>
+          <w:p>
+            <w:r>
+              <w:t>WhatsApp Servers</w:t>
+            </w:r>
+          </w:p>
+        </w:tc>
+        <w:tc>
+          <w:tcPr>
+            <w:tcW w:w="0" w:type="auto"/>
+            <w:vAlign w:val="center"/>
+            <w:hideMark/>
+          </w:tcPr>
+          <w:p>
+            <w:r>
+              <w:t>Messages, media files, contacts</w:t>
+            </w:r>
+          </w:p>
+        </w:tc>
+      </w:tr>
+      <w:tr>
+        <w:trPr>
+          <w:tblCellSpacing w:w="15" w:type="dxa"/>
+        </w:trPr>
+        <w:tc>
+          <w:tcPr>
+            <w:tcW w:w="0" w:type="auto"/>
+            <w:vAlign w:val="center"/>
+            <w:hideMark/>
+          </w:tcPr>
+          <w:p>
+            <w:r>
+              <w:t>Facebook</w:t>
+            </w:r>
+          </w:p>
+        </w:tc>
+        <w:tc>
+          <w:tcPr>
+            <w:tcW w:w="0" w:type="auto"/>
+            <w:vAlign w:val="center"/>
+            <w:hideMark/>
+          </w:tcPr>
+          <w:p>
+            <w:r>
+              <w:t>Facebook Mobile App</w:t>
+            </w:r>
+          </w:p>
+        </w:tc>
+        <w:tc>
+          <w:tcPr>
+            <w:tcW w:w="0" w:type="auto"/>
+            <w:vAlign w:val="center"/>
+            <w:hideMark/>
+          </w:tcPr>
+          <w:p>
+            <w:r>
+              <w:t>Facebook Servers</w:t>
+            </w:r>
+          </w:p>
+        </w:tc>
+        <w:tc>
+          <w:tcPr>
+            <w:tcW w:w="0" w:type="auto"/>
+            <w:vAlign w:val="center"/>
+            <w:hideMark/>
+          </w:tcPr>
+          <w:p>
+            <w:r>
+              <w:t>Posts, comments, likes, user profiles</w:t>
+            </w:r>
+          </w:p>
+        </w:tc>
+      </w:tr>
+      <w:tr>
+        <w:trPr>
+          <w:tblCellSpacing w:w="15" w:type="dxa"/>
+        </w:trPr>
+        <w:tc>
+          <w:tcPr>
+            <w:tcW w:w="0" w:type="auto"/>
+            <w:vAlign w:val="center"/>
+            <w:hideMark/>
+          </w:tcPr>
+          <w:p>
+            <w:r>
+              <w:t>Uber</w:t>
+            </w:r>
+          </w:p>
+        </w:tc>
+        <w:tc>
+          <w:tcPr>
+            <w:tcW w:w="0" w:type="auto"/>
+            <w:vAlign w:val="center"/>
+            <w:hideMark/>
+          </w:tcPr>
+          <w:p>
+            <w:r>
+              <w:t>Uber Mobile App</w:t>
+            </w:r>
+          </w:p>
+        </w:tc>
+        <w:tc>
+          <w:tcPr>
+            <w:tcW w:w="0" w:type="auto"/>
+            <w:vAlign w:val="center"/>
+            <w:hideMark/>
+          </w:tcPr>
+          <w:p>
+            <w:r>
+              <w:t>Uber Servers</w:t>
+            </w:r>
+          </w:p>
+        </w:tc>
+        <w:tc>
+          <w:tcPr>
+            <w:tcW w:w="0" w:type="auto"/>
+            <w:vAlign w:val="center"/>
+            <w:hideMark/>
+          </w:tcPr>
+          <w:p>
+            <w:r>
+              <w:t>Location data, ride requests, payment information</w:t>
+            </w:r>
+          </w:p>
+        </w:tc>
+      </w:tr>
+      <w:tr>
+        <w:trPr>
+          <w:tblCellSpacing w:w="15" w:type="dxa"/>
+        </w:trPr>
+        <w:tc>
+          <w:tcPr>
+            <w:tcW w:w="0" w:type="auto"/>
+            <w:vAlign w:val="center"/>
+            <w:hideMark/>
+          </w:tcPr>
+          <w:p>
+            <w:r>
+              <w:t>M-Pesa</w:t>
+            </w:r>
+          </w:p>
+        </w:tc>
+        <w:tc>
+          <w:tcPr>
+            <w:tcW w:w="0" w:type="auto"/>
+            <w:vAlign w:val="center"/>
+            <w:hideMark/>
+          </w:tcPr>
+          <w:p>
+            <w:r>
+              <w:t>M-Pesa Mobile App</w:t>
+            </w:r>
+          </w:p>
+        </w:tc>
+        <w:tc>
+          <w:tcPr>
+            <w:tcW w:w="0" w:type="auto"/>
+            <w:vAlign w:val="center"/>
+            <w:hideMark/>
+          </w:tcPr>
+          <w:p>
+            <w:r>
+              <w:t>Safaricom Servers</w:t>
+            </w:r>
+          </w:p>
+        </w:tc>
+        <w:tc>
+          <w:tcPr>
+            <w:tcW w:w="0" w:type="auto"/>
+            <w:vAlign w:val="center"/>
+            <w:hideMark/>
+          </w:tcPr>
+          <w:p>
+            <w:r>
+              <w:t>Transaction data, account balances, payment details</w:t>
+            </w:r>
+          </w:p>
+        </w:tc>
+      </w:tr>
+      <w:tr>
+        <w:trPr>
+          <w:tblCellSpacing w:w="15" w:type="dxa"/>
+        </w:trPr>
+        <w:tc>
+          <w:tcPr>
+            <w:tcW w:w="0" w:type="auto"/>
+            <w:vAlign w:val="center"/>
+            <w:hideMark/>
+          </w:tcPr>
+          <w:p>
+            <w:r>
+              <w:t>YouTube</w:t>
+            </w:r>
+          </w:p>
+        </w:tc>
+        <w:tc>
+          <w:tcPr>
+            <w:tcW w:w="0" w:type="auto"/>
+            <w:vAlign w:val="center"/>
+            <w:hideMark/>
+          </w:tcPr>
+          <w:p>
+            <w:r>
+              <w:t>YouTube Mobile App</w:t>
+            </w:r>
+          </w:p>
+        </w:tc>
+        <w:tc>
+          <w:tcPr>
+            <w:tcW w:w="0" w:type="auto"/>
+            <w:vAlign w:val="center"/>
+            <w:hideMark/>
+          </w:tcPr>
+          <w:p>
+            <w:r>
+              <w:t>Google Servers</w:t>
+            </w:r>
+          </w:p>
+        </w:tc>
+        <w:tc>
+          <w:tcPr>
+            <w:tcW w:w="0" w:type="auto"/>
+            <w:vAlign w:val="center"/>
+            <w:hideMark/>
+          </w:tcPr>
+          <w:p>
+            <w:r>
+              <w:t>Video streams, search queries, metadata</w:t>
+            </w:r>
+          </w:p>
+        </w:tc>
+      </w:tr>
+    </w:tbl>
+    <w:p/>
+    <w:p>
+      <w:pPr>
+        <w:rPr>
           <w:b/>
           <w:bCs/>
-          <w:sz w:val="24"/>
-          <w:szCs w:val="24"/>
-        </w:rPr>
-        <w:t>Personal Reflection</w:t>
-      </w:r>
-    </w:p>
-    <w:p>
-      <w:pPr>
-        <w:rPr>
-          <w:rFonts w:ascii="Times New Roman" w:hAnsi="Times New Roman" w:cs="Times New Roman"/>
-          <w:sz w:val="24"/>
-          <w:szCs w:val="24"/>
-        </w:rPr>
-      </w:pPr>
-      <w:r>
-        <w:rPr>
-          <w:rFonts w:ascii="Times New Roman" w:hAnsi="Times New Roman" w:cs="Times New Roman"/>
-          <w:sz w:val="24"/>
-          <w:szCs w:val="24"/>
-        </w:rPr>
-        <w:t>Fixing the login vulnerability was a critical security improvement. I implemented proper database validation so only registered users can access the app. User registration now saves to SQLite with unique email constraints. The app is now more secure and professional</w:t>
-      </w:r>
-      <w:r>
-        <w:rPr>
-          <w:rFonts w:ascii="Times New Roman" w:hAnsi="Times New Roman" w:cs="Times New Roman"/>
-          <w:i/>
-          <w:iCs/>
-          <w:sz w:val="24"/>
-          <w:szCs w:val="24"/>
-        </w:rPr>
+        </w:rPr>
+      </w:pPr>
+      <w:r>
+        <w:rPr>
+          <w:b/>
+          <w:bCs/>
+        </w:rPr>
+        <w:t>Task 2: API Investigation</w:t>
+      </w:r>
+    </w:p>
+    <w:p>
+      <w:r>
+        <w:rPr>
+          <w:b/>
+          <w:bCs/>
+        </w:rPr>
+        <w:t>API Name:</w:t>
+      </w:r>
+      <w:r>
+        <w:t xml:space="preserve"> JSON Placeholder</w:t>
+      </w:r>
+    </w:p>
+    <w:p>
+      <w:r>
+        <w:rPr>
+          <w:b/>
+          <w:bCs/>
+        </w:rPr>
+        <w:t>API URL:</w:t>
+      </w:r>
+      <w:r>
+        <w:t xml:space="preserve"> </w:t>
+      </w:r>
+      <w:hyperlink r:id="rId45" w:history="1">
+        <w:r>
+          <w:rPr>
+            <w:rStyle w:val="Hyperlink"/>
+          </w:rPr>
+          <w:t>https://jsonplaceholder.typicode.com</w:t>
+        </w:r>
+      </w:hyperlink>
+    </w:p>
+    <w:p>
+      <w:r>
+        <w:rPr>
+          <w:b/>
+          <w:bCs/>
+        </w:rPr>
+        <w:t>Purpose:</w:t>
+      </w:r>
+      <w:r>
+        <w:t xml:space="preserve"> A free fake REST API used for testing, learning, and prototyping applications without requiring a real backend.</w:t>
+      </w:r>
+    </w:p>
+    <w:p>
+      <w:r>
+        <w:rPr>
+          <w:b/>
+          <w:bCs/>
+        </w:rPr>
+        <w:t>GET Request Used:</w:t>
+      </w:r>
+    </w:p>
+    <w:p>
+      <w:r>
+        <w:t>/Posts? Limit=5</w:t>
+      </w:r>
+    </w:p>
+    <w:p>
+      <w:r>
+        <w:rPr>
+          <w:b/>
+          <w:bCs/>
+        </w:rPr>
+        <w:t>Full Endpoint:</w:t>
+      </w:r>
+    </w:p>
+    <w:p>
+      <w:r>
+        <w:t>https://jsonplaceholder.typicode.com/posts?_limit=5</w:t>
+      </w:r>
+    </w:p>
+    <w:p>
+      <w:r>
+        <w:rPr>
+          <w:b/>
+          <w:bCs/>
+        </w:rPr>
+        <w:t>Sample Response:</w:t>
+      </w:r>
+    </w:p>
+    <w:p>
+      <w:r>
+        <w:t>[</w:t>
+      </w:r>
+    </w:p>
+    <w:p>
+      <w:r>
+        <w:t xml:space="preserve">  {</w:t>
+      </w:r>
+    </w:p>
+    <w:p>
+      <w:r>
+        <w:t xml:space="preserve">    "userId": 1,</w:t>
+      </w:r>
+    </w:p>
+    <w:p>
+      <w:r>
+        <w:t xml:space="preserve">    "id": 1,</w:t>
+      </w:r>
+    </w:p>
+    <w:p>
+      <w:r>
+        <w:t xml:space="preserve">    "title": "sunt </w:t>
+      </w:r>
+      <w:proofErr w:type="spellStart"/>
+      <w:r>
+        <w:t>aut</w:t>
+      </w:r>
+      <w:proofErr w:type="spellEnd"/>
+      <w:r>
+        <w:t xml:space="preserve"> </w:t>
+      </w:r>
+      <w:proofErr w:type="spellStart"/>
+      <w:r>
+        <w:t>facere</w:t>
+      </w:r>
+      <w:proofErr w:type="spellEnd"/>
+      <w:r>
+        <w:t xml:space="preserve"> </w:t>
+      </w:r>
+      <w:proofErr w:type="spellStart"/>
+      <w:r>
+        <w:t>repellat</w:t>
+      </w:r>
+      <w:proofErr w:type="spellEnd"/>
+      <w:r>
+        <w:t xml:space="preserve"> provident </w:t>
+      </w:r>
+      <w:proofErr w:type="spellStart"/>
+      <w:r>
+        <w:t>occaecati</w:t>
+      </w:r>
+      <w:proofErr w:type="spellEnd"/>
+      <w:r>
+        <w:t>",</w:t>
+      </w:r>
+    </w:p>
+    <w:p>
+      <w:r>
+        <w:lastRenderedPageBreak/>
+        <w:t xml:space="preserve">    "body": "quia et </w:t>
+      </w:r>
+      <w:proofErr w:type="spellStart"/>
+      <w:r>
+        <w:t>suscipit</w:t>
+      </w:r>
+      <w:proofErr w:type="spellEnd"/>
+      <w:r>
+        <w:t>..."</w:t>
+      </w:r>
+    </w:p>
+    <w:p>
+      <w:r>
+        <w:t xml:space="preserve">  },</w:t>
+      </w:r>
+    </w:p>
+    <w:p>
+      <w:r>
+        <w:t xml:space="preserve">  {</w:t>
+      </w:r>
+    </w:p>
+    <w:p>
+      <w:r>
+        <w:t xml:space="preserve">    "userId": 1,</w:t>
+      </w:r>
+    </w:p>
+    <w:p>
+      <w:r>
+        <w:t xml:space="preserve">    "id": 2,</w:t>
+      </w:r>
+    </w:p>
+    <w:p>
+      <w:r>
+        <w:t xml:space="preserve">    "title": "qui est esse",</w:t>
+      </w:r>
+    </w:p>
+    <w:p>
+      <w:r>
+        <w:t xml:space="preserve">    "body": "est rerum tempore vitae..."</w:t>
+      </w:r>
+    </w:p>
+    <w:p>
+      <w:r>
+        <w:t xml:space="preserve">  }</w:t>
+      </w:r>
+    </w:p>
+    <w:p>
+      <w:r>
+        <w:t>]</w:t>
+      </w:r>
+    </w:p>
+    <w:p>
+      <w:r>
+        <w:rPr>
+          <w:b/>
+          <w:bCs/>
+        </w:rPr>
+        <w:t>Response Description:</w:t>
+      </w:r>
+      <w:r>
+        <w:br/>
+        <w:t>The API returns a JSON array containing post objects. Each object includes:</w:t>
+      </w:r>
+    </w:p>
+    <w:p>
+      <w:pPr>
+        <w:numPr>
+          <w:ilvl w:val="0"/>
+          <w:numId w:val="15"/>
+        </w:numPr>
+      </w:pPr>
+      <w:r>
+        <w:t>userId – ID of the user who created the post</w:t>
+      </w:r>
+    </w:p>
+    <w:p>
+      <w:pPr>
+        <w:numPr>
+          <w:ilvl w:val="0"/>
+          <w:numId w:val="15"/>
+        </w:numPr>
+      </w:pPr>
+      <w:r>
+        <w:t>id – Unique identifier of the post</w:t>
+      </w:r>
+    </w:p>
+    <w:p>
+      <w:pPr>
+        <w:numPr>
+          <w:ilvl w:val="0"/>
+          <w:numId w:val="15"/>
+        </w:numPr>
+      </w:pPr>
+      <w:r>
+        <w:t>title – Title of the post</w:t>
+      </w:r>
+    </w:p>
+    <w:p>
+      <w:pPr>
+        <w:numPr>
+          <w:ilvl w:val="0"/>
+          <w:numId w:val="15"/>
+        </w:numPr>
+      </w:pPr>
+      <w:r>
+        <w:t>body – Content of the post</w:t>
+      </w:r>
+    </w:p>
+    <w:p/>
+    <w:p>
+      <w:pPr>
+        <w:rPr>
+          <w:b/>
+          <w:bCs/>
+        </w:rPr>
+      </w:pPr>
+      <w:r>
+        <w:rPr>
+          <w:b/>
+          <w:bCs/>
+        </w:rPr>
+        <w:t>Task 3: JSON Creation</w:t>
+      </w:r>
+    </w:p>
+    <w:p>
+      <w:r>
+        <w:t>{</w:t>
+      </w:r>
+    </w:p>
+    <w:p>
+      <w:r>
+        <w:t xml:space="preserve">  "regno": "BIT/2025/69955",</w:t>
+      </w:r>
+    </w:p>
+    <w:p>
+      <w:r>
+        <w:t xml:space="preserve">  "name": "Rose Njeri Wainaina",</w:t>
+      </w:r>
+    </w:p>
+    <w:p>
+      <w:r>
+        <w:t xml:space="preserve">  "course": "Bachelor of Information Technology (BIT)",</w:t>
+      </w:r>
+    </w:p>
+    <w:p>
+      <w:r>
+        <w:t xml:space="preserve">  "year": 3</w:t>
+      </w:r>
+    </w:p>
+    <w:p>
+      <w:r>
+        <w:t>}</w:t>
+      </w:r>
+    </w:p>
+    <w:p>
+      <w:r>
+        <w:rPr>
+          <w:b/>
+          <w:bCs/>
+        </w:rPr>
+        <w:t>Explanation:</w:t>
+      </w:r>
+    </w:p>
+    <w:p>
+      <w:pPr>
+        <w:numPr>
+          <w:ilvl w:val="0"/>
+          <w:numId w:val="16"/>
+        </w:numPr>
+      </w:pPr>
+      <w:r>
+        <w:t>regno – Student registration number</w:t>
+      </w:r>
+    </w:p>
+    <w:p>
+      <w:pPr>
+        <w:numPr>
+          <w:ilvl w:val="0"/>
+          <w:numId w:val="16"/>
+        </w:numPr>
+      </w:pPr>
+      <w:r>
+        <w:t>name – Student's full name</w:t>
+      </w:r>
+    </w:p>
+    <w:p>
+      <w:pPr>
+        <w:numPr>
+          <w:ilvl w:val="0"/>
+          <w:numId w:val="16"/>
+        </w:numPr>
+      </w:pPr>
+      <w:r>
+        <w:lastRenderedPageBreak/>
+        <w:t>course – Course of study</w:t>
+      </w:r>
+    </w:p>
+    <w:p>
+      <w:pPr>
+        <w:numPr>
+          <w:ilvl w:val="0"/>
+          <w:numId w:val="16"/>
+        </w:numPr>
+      </w:pPr>
+      <w:r>
+        <w:t>year – Current year of study</w:t>
+      </w:r>
+    </w:p>
+    <w:p>
+      <w:r>
         <w:t>.</w:t>
       </w:r>
     </w:p>
-    <w:p>
-      <w:pPr>
-        <w:rPr>
-          <w:rFonts w:ascii="Times New Roman" w:hAnsi="Times New Roman" w:cs="Times New Roman"/>
-          <w:sz w:val="24"/>
-          <w:szCs w:val="24"/>
-        </w:rPr>
-      </w:pPr>
-      <w:r>
-        <w:rPr>
-          <w:rFonts w:ascii="Times New Roman" w:hAnsi="Times New Roman" w:cs="Times New Roman"/>
-          <w:sz w:val="24"/>
-          <w:szCs w:val="24"/>
-        </w:rPr>
-        <w:br w:type="page"/>
-      </w:r>
-    </w:p>
+    <w:p/>
+    <w:p>
+      <w:pPr>
+        <w:spacing w:before="100" w:beforeAutospacing="1" w:after="100" w:afterAutospacing="1" w:line="240" w:lineRule="auto"/>
+        <w:outlineLvl w:val="0"/>
+        <w:rPr>
+          <w:rFonts w:ascii="Times New Roman" w:eastAsia="Times New Roman" w:hAnsi="Times New Roman" w:cs="Times New Roman"/>
+          <w:b/>
+          <w:bCs/>
+          <w:kern w:val="36"/>
+          <w:sz w:val="48"/>
+          <w:szCs w:val="48"/>
+        </w:rPr>
+      </w:pPr>
+      <w:r>
+        <w:rPr>
+          <w:rFonts w:ascii="Times New Roman" w:eastAsia="Times New Roman" w:hAnsi="Times New Roman" w:cs="Times New Roman"/>
+          <w:b/>
+          <w:bCs/>
+          <w:kern w:val="36"/>
+          <w:sz w:val="48"/>
+          <w:szCs w:val="48"/>
+        </w:rPr>
+        <w:t>Week 7: Data Storage and Database Integration</w:t>
+      </w:r>
+    </w:p>
+    <w:p>
+      <w:pPr>
+        <w:spacing w:before="100" w:beforeAutospacing="1" w:after="100" w:afterAutospacing="1" w:line="240" w:lineRule="auto"/>
+        <w:outlineLvl w:val="1"/>
+        <w:rPr>
+          <w:rFonts w:ascii="Times New Roman" w:eastAsia="Times New Roman" w:hAnsi="Times New Roman" w:cs="Times New Roman"/>
+          <w:b/>
+          <w:bCs/>
+          <w:sz w:val="36"/>
+          <w:szCs w:val="36"/>
+        </w:rPr>
+      </w:pPr>
+      <w:r>
+        <w:rPr>
+          <w:rFonts w:ascii="Times New Roman" w:eastAsia="Times New Roman" w:hAnsi="Times New Roman" w:cs="Times New Roman"/>
+          <w:b/>
+          <w:bCs/>
+          <w:sz w:val="36"/>
+          <w:szCs w:val="36"/>
+        </w:rPr>
+        <w:t>Task 1: Storage Method Comparison</w:t>
+      </w:r>
+    </w:p>
+    <w:tbl>
+      <w:tblPr>
+        <w:tblW w:w="0" w:type="auto"/>
+        <w:tblCellSpacing w:w="15" w:type="dxa"/>
+        <w:tblInd w:w="-90" w:type="dxa"/>
+        <w:tblBorders>
+          <w:top w:val="single" w:sz="4" w:space="0" w:color="auto"/>
+          <w:left w:val="single" w:sz="4" w:space="0" w:color="auto"/>
+          <w:bottom w:val="single" w:sz="4" w:space="0" w:color="auto"/>
+          <w:right w:val="single" w:sz="4" w:space="0" w:color="auto"/>
+          <w:insideH w:val="single" w:sz="4" w:space="0" w:color="auto"/>
+          <w:insideV w:val="single" w:sz="4" w:space="0" w:color="auto"/>
+        </w:tblBorders>
+        <w:tblCellMar>
+          <w:top w:w="15" w:type="dxa"/>
+          <w:left w:w="15" w:type="dxa"/>
+          <w:bottom w:w="15" w:type="dxa"/>
+          <w:right w:w="15" w:type="dxa"/>
+        </w:tblCellMar>
+        <w:tblLook w:val="04A0" w:firstRow="1" w:lastRow="0" w:firstColumn="1" w:lastColumn="0" w:noHBand="0" w:noVBand="1"/>
+      </w:tblPr>
+      <w:tblGrid>
+        <w:gridCol w:w="1512"/>
+        <w:gridCol w:w="3242"/>
+        <w:gridCol w:w="3966"/>
+      </w:tblGrid>
+      <w:tr>
+        <w:trPr>
+          <w:tblHeader/>
+          <w:tblCellSpacing w:w="15" w:type="dxa"/>
+        </w:trPr>
+        <w:tc>
+          <w:tcPr>
+            <w:tcW w:w="1467" w:type="dxa"/>
+            <w:vAlign w:val="center"/>
+            <w:hideMark/>
+          </w:tcPr>
+          <w:p>
+            <w:pPr>
+              <w:spacing w:after="0" w:line="240" w:lineRule="auto"/>
+              <w:jc w:val="center"/>
+              <w:rPr>
+                <w:rFonts w:ascii="Times New Roman" w:eastAsia="Times New Roman" w:hAnsi="Times New Roman" w:cs="Times New Roman"/>
+                <w:b/>
+                <w:bCs/>
+                <w:sz w:val="24"/>
+                <w:szCs w:val="24"/>
+              </w:rPr>
+            </w:pPr>
+            <w:r>
+              <w:rPr>
+                <w:rFonts w:ascii="Times New Roman" w:eastAsia="Times New Roman" w:hAnsi="Times New Roman" w:cs="Times New Roman"/>
+                <w:b/>
+                <w:bCs/>
+                <w:sz w:val="24"/>
+                <w:szCs w:val="24"/>
+              </w:rPr>
+              <w:t>Storage Method</w:t>
+            </w:r>
+          </w:p>
+        </w:tc>
+        <w:tc>
+          <w:tcPr>
+            <w:tcW w:w="0" w:type="auto"/>
+            <w:vAlign w:val="center"/>
+            <w:hideMark/>
+          </w:tcPr>
+          <w:p>
+            <w:pPr>
+              <w:spacing w:after="0" w:line="240" w:lineRule="auto"/>
+              <w:jc w:val="center"/>
+              <w:rPr>
+                <w:rFonts w:ascii="Times New Roman" w:eastAsia="Times New Roman" w:hAnsi="Times New Roman" w:cs="Times New Roman"/>
+                <w:b/>
+                <w:bCs/>
+                <w:sz w:val="24"/>
+                <w:szCs w:val="24"/>
+              </w:rPr>
+            </w:pPr>
+            <w:r>
+              <w:rPr>
+                <w:rFonts w:ascii="Times New Roman" w:eastAsia="Times New Roman" w:hAnsi="Times New Roman" w:cs="Times New Roman"/>
+                <w:b/>
+                <w:bCs/>
+                <w:sz w:val="24"/>
+                <w:szCs w:val="24"/>
+              </w:rPr>
+              <w:t>Advantages</w:t>
+            </w:r>
+          </w:p>
+        </w:tc>
+        <w:tc>
+          <w:tcPr>
+            <w:tcW w:w="0" w:type="auto"/>
+            <w:vAlign w:val="center"/>
+            <w:hideMark/>
+          </w:tcPr>
+          <w:p>
+            <w:pPr>
+              <w:spacing w:after="0" w:line="240" w:lineRule="auto"/>
+              <w:jc w:val="center"/>
+              <w:rPr>
+                <w:rFonts w:ascii="Times New Roman" w:eastAsia="Times New Roman" w:hAnsi="Times New Roman" w:cs="Times New Roman"/>
+                <w:b/>
+                <w:bCs/>
+                <w:sz w:val="24"/>
+                <w:szCs w:val="24"/>
+              </w:rPr>
+            </w:pPr>
+            <w:r>
+              <w:rPr>
+                <w:rFonts w:ascii="Times New Roman" w:eastAsia="Times New Roman" w:hAnsi="Times New Roman" w:cs="Times New Roman"/>
+                <w:b/>
+                <w:bCs/>
+                <w:sz w:val="24"/>
+                <w:szCs w:val="24"/>
+              </w:rPr>
+              <w:t>Disadvantages</w:t>
+            </w:r>
+          </w:p>
+        </w:tc>
+      </w:tr>
+      <w:tr>
+        <w:trPr>
+          <w:tblCellSpacing w:w="15" w:type="dxa"/>
+        </w:trPr>
+        <w:tc>
+          <w:tcPr>
+            <w:tcW w:w="1467" w:type="dxa"/>
+            <w:vAlign w:val="center"/>
+            <w:hideMark/>
+          </w:tcPr>
+          <w:p>
+            <w:pPr>
+              <w:spacing w:after="0" w:line="240" w:lineRule="auto"/>
+              <w:rPr>
+                <w:rFonts w:ascii="Times New Roman" w:eastAsia="Times New Roman" w:hAnsi="Times New Roman" w:cs="Times New Roman"/>
+                <w:sz w:val="24"/>
+                <w:szCs w:val="24"/>
+              </w:rPr>
+            </w:pPr>
+            <w:r>
+              <w:rPr>
+                <w:rFonts w:ascii="Times New Roman" w:eastAsia="Times New Roman" w:hAnsi="Times New Roman" w:cs="Times New Roman"/>
+                <w:b/>
+                <w:bCs/>
+                <w:sz w:val="24"/>
+                <w:szCs w:val="24"/>
+              </w:rPr>
+              <w:t>Shared Preferences</w:t>
+            </w:r>
+          </w:p>
+        </w:tc>
+        <w:tc>
+          <w:tcPr>
+            <w:tcW w:w="0" w:type="auto"/>
+            <w:vAlign w:val="center"/>
+            <w:hideMark/>
+          </w:tcPr>
+          <w:p>
+            <w:pPr>
+              <w:spacing w:after="0" w:line="240" w:lineRule="auto"/>
+              <w:rPr>
+                <w:rFonts w:ascii="Times New Roman" w:eastAsia="Times New Roman" w:hAnsi="Times New Roman" w:cs="Times New Roman"/>
+                <w:sz w:val="24"/>
+                <w:szCs w:val="24"/>
+              </w:rPr>
+            </w:pPr>
+            <w:r>
+              <w:rPr>
+                <w:rFonts w:ascii="Times New Roman" w:eastAsia="Times New Roman" w:hAnsi="Times New Roman" w:cs="Times New Roman"/>
+                <w:sz w:val="24"/>
+                <w:szCs w:val="24"/>
+              </w:rPr>
+              <w:t>Fast, easy to implement, lightweight, suitable for storing user settings and small amounts of data.</w:t>
+            </w:r>
+          </w:p>
+        </w:tc>
+        <w:tc>
+          <w:tcPr>
+            <w:tcW w:w="0" w:type="auto"/>
+            <w:vAlign w:val="center"/>
+            <w:hideMark/>
+          </w:tcPr>
+          <w:p>
+            <w:pPr>
+              <w:spacing w:after="0" w:line="240" w:lineRule="auto"/>
+              <w:rPr>
+                <w:rFonts w:ascii="Times New Roman" w:eastAsia="Times New Roman" w:hAnsi="Times New Roman" w:cs="Times New Roman"/>
+                <w:sz w:val="24"/>
+                <w:szCs w:val="24"/>
+              </w:rPr>
+            </w:pPr>
+            <w:r>
+              <w:rPr>
+                <w:rFonts w:ascii="Times New Roman" w:eastAsia="Times New Roman" w:hAnsi="Times New Roman" w:cs="Times New Roman"/>
+                <w:sz w:val="24"/>
+                <w:szCs w:val="24"/>
+              </w:rPr>
+              <w:t>Limited to small key-value pairs, cannot store complex or relational data, no querying support.</w:t>
+            </w:r>
+          </w:p>
+        </w:tc>
+      </w:tr>
+      <w:tr>
+        <w:trPr>
+          <w:tblCellSpacing w:w="15" w:type="dxa"/>
+        </w:trPr>
+        <w:tc>
+          <w:tcPr>
+            <w:tcW w:w="1467" w:type="dxa"/>
+            <w:vAlign w:val="center"/>
+            <w:hideMark/>
+          </w:tcPr>
+          <w:p>
+            <w:pPr>
+              <w:spacing w:after="0" w:line="240" w:lineRule="auto"/>
+              <w:rPr>
+                <w:rFonts w:ascii="Times New Roman" w:eastAsia="Times New Roman" w:hAnsi="Times New Roman" w:cs="Times New Roman"/>
+                <w:sz w:val="24"/>
+                <w:szCs w:val="24"/>
+              </w:rPr>
+            </w:pPr>
+            <w:r>
+              <w:rPr>
+                <w:rFonts w:ascii="Times New Roman" w:eastAsia="Times New Roman" w:hAnsi="Times New Roman" w:cs="Times New Roman"/>
+                <w:b/>
+                <w:bCs/>
+                <w:sz w:val="24"/>
+                <w:szCs w:val="24"/>
+              </w:rPr>
+              <w:t>SQLite</w:t>
+            </w:r>
+          </w:p>
+        </w:tc>
+        <w:tc>
+          <w:tcPr>
+            <w:tcW w:w="0" w:type="auto"/>
+            <w:vAlign w:val="center"/>
+            <w:hideMark/>
+          </w:tcPr>
+          <w:p>
+            <w:pPr>
+              <w:spacing w:after="0" w:line="240" w:lineRule="auto"/>
+              <w:rPr>
+                <w:rFonts w:ascii="Times New Roman" w:eastAsia="Times New Roman" w:hAnsi="Times New Roman" w:cs="Times New Roman"/>
+                <w:sz w:val="24"/>
+                <w:szCs w:val="24"/>
+              </w:rPr>
+            </w:pPr>
+            <w:r>
+              <w:rPr>
+                <w:rFonts w:ascii="Times New Roman" w:eastAsia="Times New Roman" w:hAnsi="Times New Roman" w:cs="Times New Roman"/>
+                <w:sz w:val="24"/>
+                <w:szCs w:val="24"/>
+              </w:rPr>
+              <w:t>Relational database, supports offline storage, powerful SQL queries, secure and efficient for structured data.</w:t>
+            </w:r>
+          </w:p>
+        </w:tc>
+        <w:tc>
+          <w:tcPr>
+            <w:tcW w:w="0" w:type="auto"/>
+            <w:vAlign w:val="center"/>
+            <w:hideMark/>
+          </w:tcPr>
+          <w:p>
+            <w:pPr>
+              <w:spacing w:after="0" w:line="240" w:lineRule="auto"/>
+              <w:rPr>
+                <w:rFonts w:ascii="Times New Roman" w:eastAsia="Times New Roman" w:hAnsi="Times New Roman" w:cs="Times New Roman"/>
+                <w:sz w:val="24"/>
+                <w:szCs w:val="24"/>
+              </w:rPr>
+            </w:pPr>
+            <w:r>
+              <w:rPr>
+                <w:rFonts w:ascii="Times New Roman" w:eastAsia="Times New Roman" w:hAnsi="Times New Roman" w:cs="Times New Roman"/>
+                <w:sz w:val="24"/>
+                <w:szCs w:val="24"/>
+              </w:rPr>
+              <w:t>Requires knowledge of SQL, more complex to implement and maintain compared to simple storage methods.</w:t>
+            </w:r>
+          </w:p>
+        </w:tc>
+      </w:tr>
+      <w:tr>
+        <w:trPr>
+          <w:tblCellSpacing w:w="15" w:type="dxa"/>
+        </w:trPr>
+        <w:tc>
+          <w:tcPr>
+            <w:tcW w:w="1467" w:type="dxa"/>
+            <w:vAlign w:val="center"/>
+            <w:hideMark/>
+          </w:tcPr>
+          <w:p>
+            <w:pPr>
+              <w:spacing w:after="0" w:line="240" w:lineRule="auto"/>
+              <w:rPr>
+                <w:rFonts w:ascii="Times New Roman" w:eastAsia="Times New Roman" w:hAnsi="Times New Roman" w:cs="Times New Roman"/>
+                <w:sz w:val="24"/>
+                <w:szCs w:val="24"/>
+              </w:rPr>
+            </w:pPr>
+            <w:r>
+              <w:rPr>
+                <w:rFonts w:ascii="Times New Roman" w:eastAsia="Times New Roman" w:hAnsi="Times New Roman" w:cs="Times New Roman"/>
+                <w:b/>
+                <w:bCs/>
+                <w:sz w:val="24"/>
+                <w:szCs w:val="24"/>
+              </w:rPr>
+              <w:t>Internal Storage</w:t>
+            </w:r>
+          </w:p>
+        </w:tc>
+        <w:tc>
+          <w:tcPr>
+            <w:tcW w:w="0" w:type="auto"/>
+            <w:vAlign w:val="center"/>
+            <w:hideMark/>
+          </w:tcPr>
+          <w:p>
+            <w:pPr>
+              <w:spacing w:after="0" w:line="240" w:lineRule="auto"/>
+              <w:rPr>
+                <w:rFonts w:ascii="Times New Roman" w:eastAsia="Times New Roman" w:hAnsi="Times New Roman" w:cs="Times New Roman"/>
+                <w:sz w:val="24"/>
+                <w:szCs w:val="24"/>
+              </w:rPr>
+            </w:pPr>
+            <w:r>
+              <w:rPr>
+                <w:rFonts w:ascii="Times New Roman" w:eastAsia="Times New Roman" w:hAnsi="Times New Roman" w:cs="Times New Roman"/>
+                <w:sz w:val="24"/>
+                <w:szCs w:val="24"/>
+              </w:rPr>
+              <w:t>Simple and secure file storage, data is private to the application, suitable for storing files and documents.</w:t>
+            </w:r>
+          </w:p>
+        </w:tc>
+        <w:tc>
+          <w:tcPr>
+            <w:tcW w:w="0" w:type="auto"/>
+            <w:vAlign w:val="center"/>
+            <w:hideMark/>
+          </w:tcPr>
+          <w:p>
+            <w:pPr>
+              <w:spacing w:after="0" w:line="240" w:lineRule="auto"/>
+              <w:rPr>
+                <w:rFonts w:ascii="Times New Roman" w:eastAsia="Times New Roman" w:hAnsi="Times New Roman" w:cs="Times New Roman"/>
+                <w:sz w:val="24"/>
+                <w:szCs w:val="24"/>
+              </w:rPr>
+            </w:pPr>
+            <w:r>
+              <w:rPr>
+                <w:rFonts w:ascii="Times New Roman" w:eastAsia="Times New Roman" w:hAnsi="Times New Roman" w:cs="Times New Roman"/>
+                <w:sz w:val="24"/>
+                <w:szCs w:val="24"/>
+              </w:rPr>
+              <w:t>Not suitable for structured data, limited organization and search capabilities, and managing files can become difficult as data grows.</w:t>
+            </w:r>
+          </w:p>
+        </w:tc>
+      </w:tr>
+    </w:tbl>
+    <w:p>
+      <w:pPr>
+        <w:spacing w:after="0" w:line="240" w:lineRule="auto"/>
+        <w:rPr>
+          <w:rFonts w:ascii="Times New Roman" w:eastAsia="Times New Roman" w:hAnsi="Times New Roman" w:cs="Times New Roman"/>
+          <w:sz w:val="24"/>
+          <w:szCs w:val="24"/>
+        </w:rPr>
+      </w:pPr>
+    </w:p>
+    <w:p>
+      <w:pPr>
+        <w:spacing w:before="100" w:beforeAutospacing="1" w:after="100" w:afterAutospacing="1" w:line="240" w:lineRule="auto"/>
+        <w:outlineLvl w:val="1"/>
+        <w:rPr>
+          <w:rFonts w:ascii="Times New Roman" w:eastAsia="Times New Roman" w:hAnsi="Times New Roman" w:cs="Times New Roman"/>
+          <w:b/>
+          <w:bCs/>
+          <w:sz w:val="36"/>
+          <w:szCs w:val="36"/>
+        </w:rPr>
+      </w:pPr>
+      <w:r>
+        <w:rPr>
+          <w:rFonts w:ascii="Times New Roman" w:eastAsia="Times New Roman" w:hAnsi="Times New Roman" w:cs="Times New Roman"/>
+          <w:b/>
+          <w:bCs/>
+          <w:sz w:val="36"/>
+          <w:szCs w:val="36"/>
+        </w:rPr>
+        <w:t>Task 2: Student Database Design</w:t>
+      </w:r>
+    </w:p>
+    <w:p>
+      <w:pPr>
+        <w:spacing w:before="100" w:beforeAutospacing="1" w:after="100" w:afterAutospacing="1" w:line="240" w:lineRule="auto"/>
+        <w:outlineLvl w:val="2"/>
+        <w:rPr>
+          <w:rFonts w:ascii="Times New Roman" w:eastAsia="Times New Roman" w:hAnsi="Times New Roman" w:cs="Times New Roman"/>
+          <w:b/>
+          <w:bCs/>
+          <w:sz w:val="27"/>
+          <w:szCs w:val="27"/>
+        </w:rPr>
+      </w:pPr>
+      <w:r>
+        <w:rPr>
+          <w:rFonts w:ascii="Times New Roman" w:eastAsia="Times New Roman" w:hAnsi="Times New Roman" w:cs="Times New Roman"/>
+          <w:b/>
+          <w:bCs/>
+          <w:sz w:val="27"/>
+          <w:szCs w:val="27"/>
+        </w:rPr>
+        <w:t>Students Table</w:t>
+      </w:r>
+    </w:p>
+    <w:tbl>
+      <w:tblPr>
+        <w:tblW w:w="0" w:type="auto"/>
+        <w:tblCellSpacing w:w="15" w:type="dxa"/>
+        <w:tblBorders>
+          <w:top w:val="single" w:sz="4" w:space="0" w:color="auto"/>
+          <w:left w:val="single" w:sz="4" w:space="0" w:color="auto"/>
+          <w:bottom w:val="single" w:sz="4" w:space="0" w:color="auto"/>
+          <w:right w:val="single" w:sz="4" w:space="0" w:color="auto"/>
+          <w:insideH w:val="single" w:sz="4" w:space="0" w:color="auto"/>
+          <w:insideV w:val="single" w:sz="4" w:space="0" w:color="auto"/>
+        </w:tblBorders>
+        <w:tblCellMar>
+          <w:top w:w="15" w:type="dxa"/>
+          <w:left w:w="15" w:type="dxa"/>
+          <w:bottom w:w="15" w:type="dxa"/>
+          <w:right w:w="15" w:type="dxa"/>
+        </w:tblCellMar>
+        <w:tblLook w:val="04A0" w:firstRow="1" w:lastRow="0" w:firstColumn="1" w:lastColumn="0" w:noHBand="0" w:noVBand="1"/>
+      </w:tblPr>
+      <w:tblGrid>
+        <w:gridCol w:w="1275"/>
+        <w:gridCol w:w="1633"/>
+        <w:gridCol w:w="1435"/>
+      </w:tblGrid>
+      <w:tr>
+        <w:trPr>
+          <w:tblHeader/>
+          <w:tblCellSpacing w:w="15" w:type="dxa"/>
+        </w:trPr>
+        <w:tc>
+          <w:tcPr>
+            <w:tcW w:w="0" w:type="auto"/>
+            <w:vAlign w:val="center"/>
+            <w:hideMark/>
+          </w:tcPr>
+          <w:p>
+            <w:pPr>
+              <w:spacing w:after="0" w:line="240" w:lineRule="auto"/>
+              <w:jc w:val="center"/>
+              <w:rPr>
+                <w:rFonts w:ascii="Times New Roman" w:eastAsia="Times New Roman" w:hAnsi="Times New Roman" w:cs="Times New Roman"/>
+                <w:b/>
+                <w:bCs/>
+                <w:sz w:val="24"/>
+                <w:szCs w:val="24"/>
+              </w:rPr>
+            </w:pPr>
+            <w:r>
+              <w:rPr>
+                <w:rFonts w:ascii="Times New Roman" w:eastAsia="Times New Roman" w:hAnsi="Times New Roman" w:cs="Times New Roman"/>
+                <w:b/>
+                <w:bCs/>
+                <w:sz w:val="24"/>
+                <w:szCs w:val="24"/>
+              </w:rPr>
+              <w:t>Field Name</w:t>
+            </w:r>
+          </w:p>
+        </w:tc>
+        <w:tc>
+          <w:tcPr>
+            <w:tcW w:w="0" w:type="auto"/>
+            <w:vAlign w:val="center"/>
+            <w:hideMark/>
+          </w:tcPr>
+          <w:p>
+            <w:pPr>
+              <w:spacing w:after="0" w:line="240" w:lineRule="auto"/>
+              <w:jc w:val="center"/>
+              <w:rPr>
+                <w:rFonts w:ascii="Times New Roman" w:eastAsia="Times New Roman" w:hAnsi="Times New Roman" w:cs="Times New Roman"/>
+                <w:b/>
+                <w:bCs/>
+                <w:sz w:val="24"/>
+                <w:szCs w:val="24"/>
+              </w:rPr>
+            </w:pPr>
+            <w:r>
+              <w:rPr>
+                <w:rFonts w:ascii="Times New Roman" w:eastAsia="Times New Roman" w:hAnsi="Times New Roman" w:cs="Times New Roman"/>
+                <w:b/>
+                <w:bCs/>
+                <w:sz w:val="24"/>
+                <w:szCs w:val="24"/>
+              </w:rPr>
+              <w:t>Data Type</w:t>
+            </w:r>
+          </w:p>
+        </w:tc>
+        <w:tc>
+          <w:tcPr>
+            <w:tcW w:w="0" w:type="auto"/>
+            <w:vAlign w:val="center"/>
+            <w:hideMark/>
+          </w:tcPr>
+          <w:p>
+            <w:pPr>
+              <w:spacing w:after="0" w:line="240" w:lineRule="auto"/>
+              <w:jc w:val="center"/>
+              <w:rPr>
+                <w:rFonts w:ascii="Times New Roman" w:eastAsia="Times New Roman" w:hAnsi="Times New Roman" w:cs="Times New Roman"/>
+                <w:b/>
+                <w:bCs/>
+                <w:sz w:val="24"/>
+                <w:szCs w:val="24"/>
+              </w:rPr>
+            </w:pPr>
+            <w:r>
+              <w:rPr>
+                <w:rFonts w:ascii="Times New Roman" w:eastAsia="Times New Roman" w:hAnsi="Times New Roman" w:cs="Times New Roman"/>
+                <w:b/>
+                <w:bCs/>
+                <w:sz w:val="24"/>
+                <w:szCs w:val="24"/>
+              </w:rPr>
+              <w:t>Primary Key</w:t>
+            </w:r>
+          </w:p>
+        </w:tc>
+      </w:tr>
+      <w:tr>
+        <w:trPr>
+          <w:tblCellSpacing w:w="15" w:type="dxa"/>
+        </w:trPr>
+        <w:tc>
+          <w:tcPr>
+            <w:tcW w:w="0" w:type="auto"/>
+            <w:vAlign w:val="center"/>
+            <w:hideMark/>
+          </w:tcPr>
+          <w:p>
+            <w:pPr>
+              <w:spacing w:after="0" w:line="240" w:lineRule="auto"/>
+              <w:rPr>
+                <w:rFonts w:ascii="Times New Roman" w:eastAsia="Times New Roman" w:hAnsi="Times New Roman" w:cs="Times New Roman"/>
+                <w:sz w:val="24"/>
+                <w:szCs w:val="24"/>
+              </w:rPr>
+            </w:pPr>
+            <w:r>
+              <w:rPr>
+                <w:rFonts w:ascii="Times New Roman" w:eastAsia="Times New Roman" w:hAnsi="Times New Roman" w:cs="Times New Roman"/>
+                <w:sz w:val="24"/>
+                <w:szCs w:val="24"/>
+              </w:rPr>
+              <w:t>id</w:t>
+            </w:r>
+          </w:p>
+        </w:tc>
+        <w:tc>
+          <w:tcPr>
+            <w:tcW w:w="0" w:type="auto"/>
+            <w:vAlign w:val="center"/>
+            <w:hideMark/>
+          </w:tcPr>
+          <w:p>
+            <w:pPr>
+              <w:spacing w:after="0" w:line="240" w:lineRule="auto"/>
+              <w:rPr>
+                <w:rFonts w:ascii="Times New Roman" w:eastAsia="Times New Roman" w:hAnsi="Times New Roman" w:cs="Times New Roman"/>
+                <w:sz w:val="24"/>
+                <w:szCs w:val="24"/>
+              </w:rPr>
+            </w:pPr>
+            <w:r>
+              <w:rPr>
+                <w:rFonts w:ascii="Times New Roman" w:eastAsia="Times New Roman" w:hAnsi="Times New Roman" w:cs="Times New Roman"/>
+                <w:sz w:val="24"/>
+                <w:szCs w:val="24"/>
+              </w:rPr>
+              <w:t>INTEGER</w:t>
+            </w:r>
+          </w:p>
+        </w:tc>
+        <w:tc>
+          <w:tcPr>
+            <w:tcW w:w="0" w:type="auto"/>
+            <w:vAlign w:val="center"/>
+            <w:hideMark/>
+          </w:tcPr>
+          <w:p>
+            <w:pPr>
+              <w:spacing w:after="0" w:line="240" w:lineRule="auto"/>
+              <w:rPr>
+                <w:rFonts w:ascii="Times New Roman" w:eastAsia="Times New Roman" w:hAnsi="Times New Roman" w:cs="Times New Roman"/>
+                <w:sz w:val="24"/>
+                <w:szCs w:val="24"/>
+              </w:rPr>
+            </w:pPr>
+            <w:r>
+              <w:rPr>
+                <w:rFonts w:ascii="Times New Roman" w:eastAsia="Times New Roman" w:hAnsi="Times New Roman" w:cs="Times New Roman"/>
+                <w:sz w:val="24"/>
+                <w:szCs w:val="24"/>
+              </w:rPr>
+              <w:t>Yes</w:t>
+            </w:r>
+          </w:p>
+        </w:tc>
+      </w:tr>
+      <w:tr>
+        <w:trPr>
+          <w:tblCellSpacing w:w="15" w:type="dxa"/>
+        </w:trPr>
+        <w:tc>
+          <w:tcPr>
+            <w:tcW w:w="0" w:type="auto"/>
+            <w:vAlign w:val="center"/>
+            <w:hideMark/>
+          </w:tcPr>
+          <w:p>
+            <w:pPr>
+              <w:spacing w:after="0" w:line="240" w:lineRule="auto"/>
+              <w:rPr>
+                <w:rFonts w:ascii="Times New Roman" w:eastAsia="Times New Roman" w:hAnsi="Times New Roman" w:cs="Times New Roman"/>
+                <w:sz w:val="24"/>
+                <w:szCs w:val="24"/>
+              </w:rPr>
+            </w:pPr>
+            <w:r>
+              <w:rPr>
+                <w:rFonts w:ascii="Times New Roman" w:eastAsia="Times New Roman" w:hAnsi="Times New Roman" w:cs="Times New Roman"/>
+                <w:sz w:val="24"/>
+                <w:szCs w:val="24"/>
+              </w:rPr>
+              <w:t>full Name</w:t>
+            </w:r>
+          </w:p>
+        </w:tc>
+        <w:tc>
+          <w:tcPr>
+            <w:tcW w:w="0" w:type="auto"/>
+            <w:vAlign w:val="center"/>
+            <w:hideMark/>
+          </w:tcPr>
+          <w:p>
+            <w:pPr>
+              <w:spacing w:after="0" w:line="240" w:lineRule="auto"/>
+              <w:rPr>
+                <w:rFonts w:ascii="Times New Roman" w:eastAsia="Times New Roman" w:hAnsi="Times New Roman" w:cs="Times New Roman"/>
+                <w:sz w:val="24"/>
+                <w:szCs w:val="24"/>
+              </w:rPr>
+            </w:pPr>
+            <w:r>
+              <w:rPr>
+                <w:rFonts w:ascii="Times New Roman" w:eastAsia="Times New Roman" w:hAnsi="Times New Roman" w:cs="Times New Roman"/>
+                <w:sz w:val="24"/>
+                <w:szCs w:val="24"/>
+              </w:rPr>
+              <w:t>TEXT</w:t>
+            </w:r>
+          </w:p>
+        </w:tc>
+        <w:tc>
+          <w:tcPr>
+            <w:tcW w:w="0" w:type="auto"/>
+            <w:vAlign w:val="center"/>
+            <w:hideMark/>
+          </w:tcPr>
+          <w:p>
+            <w:pPr>
+              <w:spacing w:after="0" w:line="240" w:lineRule="auto"/>
+              <w:rPr>
+                <w:rFonts w:ascii="Times New Roman" w:eastAsia="Times New Roman" w:hAnsi="Times New Roman" w:cs="Times New Roman"/>
+                <w:sz w:val="24"/>
+                <w:szCs w:val="24"/>
+              </w:rPr>
+            </w:pPr>
+            <w:r>
+              <w:rPr>
+                <w:rFonts w:ascii="Times New Roman" w:eastAsia="Times New Roman" w:hAnsi="Times New Roman" w:cs="Times New Roman"/>
+                <w:sz w:val="24"/>
+                <w:szCs w:val="24"/>
+              </w:rPr>
+              <w:t>No</w:t>
+            </w:r>
+          </w:p>
+        </w:tc>
+      </w:tr>
+      <w:tr>
+        <w:trPr>
+          <w:tblCellSpacing w:w="15" w:type="dxa"/>
+        </w:trPr>
+        <w:tc>
+          <w:tcPr>
+            <w:tcW w:w="0" w:type="auto"/>
+            <w:vAlign w:val="center"/>
+            <w:hideMark/>
+          </w:tcPr>
+          <w:p>
+            <w:pPr>
+              <w:spacing w:after="0" w:line="240" w:lineRule="auto"/>
+              <w:rPr>
+                <w:rFonts w:ascii="Times New Roman" w:eastAsia="Times New Roman" w:hAnsi="Times New Roman" w:cs="Times New Roman"/>
+                <w:sz w:val="24"/>
+                <w:szCs w:val="24"/>
+              </w:rPr>
+            </w:pPr>
+            <w:r>
+              <w:rPr>
+                <w:rFonts w:ascii="Times New Roman" w:eastAsia="Times New Roman" w:hAnsi="Times New Roman" w:cs="Times New Roman"/>
+                <w:sz w:val="24"/>
+                <w:szCs w:val="24"/>
+              </w:rPr>
+              <w:t>email</w:t>
+            </w:r>
+          </w:p>
+        </w:tc>
+        <w:tc>
+          <w:tcPr>
+            <w:tcW w:w="0" w:type="auto"/>
+            <w:vAlign w:val="center"/>
+            <w:hideMark/>
+          </w:tcPr>
+          <w:p>
+            <w:pPr>
+              <w:spacing w:after="0" w:line="240" w:lineRule="auto"/>
+              <w:rPr>
+                <w:rFonts w:ascii="Times New Roman" w:eastAsia="Times New Roman" w:hAnsi="Times New Roman" w:cs="Times New Roman"/>
+                <w:sz w:val="24"/>
+                <w:szCs w:val="24"/>
+              </w:rPr>
+            </w:pPr>
+            <w:r>
+              <w:rPr>
+                <w:rFonts w:ascii="Times New Roman" w:eastAsia="Times New Roman" w:hAnsi="Times New Roman" w:cs="Times New Roman"/>
+                <w:sz w:val="24"/>
+                <w:szCs w:val="24"/>
+              </w:rPr>
+              <w:t>TEXT</w:t>
+            </w:r>
+          </w:p>
+        </w:tc>
+        <w:tc>
+          <w:tcPr>
+            <w:tcW w:w="0" w:type="auto"/>
+            <w:vAlign w:val="center"/>
+            <w:hideMark/>
+          </w:tcPr>
+          <w:p>
+            <w:pPr>
+              <w:spacing w:after="0" w:line="240" w:lineRule="auto"/>
+              <w:rPr>
+                <w:rFonts w:ascii="Times New Roman" w:eastAsia="Times New Roman" w:hAnsi="Times New Roman" w:cs="Times New Roman"/>
+                <w:sz w:val="24"/>
+                <w:szCs w:val="24"/>
+              </w:rPr>
+            </w:pPr>
+            <w:r>
+              <w:rPr>
+                <w:rFonts w:ascii="Times New Roman" w:eastAsia="Times New Roman" w:hAnsi="Times New Roman" w:cs="Times New Roman"/>
+                <w:sz w:val="24"/>
+                <w:szCs w:val="24"/>
+              </w:rPr>
+              <w:t>No</w:t>
+            </w:r>
+          </w:p>
+        </w:tc>
+      </w:tr>
+      <w:tr>
+        <w:trPr>
+          <w:tblCellSpacing w:w="15" w:type="dxa"/>
+        </w:trPr>
+        <w:tc>
+          <w:tcPr>
+            <w:tcW w:w="0" w:type="auto"/>
+            <w:vAlign w:val="center"/>
+            <w:hideMark/>
+          </w:tcPr>
+          <w:p>
+            <w:pPr>
+              <w:spacing w:after="0" w:line="240" w:lineRule="auto"/>
+              <w:rPr>
+                <w:rFonts w:ascii="Times New Roman" w:eastAsia="Times New Roman" w:hAnsi="Times New Roman" w:cs="Times New Roman"/>
+                <w:sz w:val="24"/>
+                <w:szCs w:val="24"/>
+              </w:rPr>
+            </w:pPr>
+            <w:r>
+              <w:rPr>
+                <w:rFonts w:ascii="Times New Roman" w:eastAsia="Times New Roman" w:hAnsi="Times New Roman" w:cs="Times New Roman"/>
+                <w:sz w:val="24"/>
+                <w:szCs w:val="24"/>
+              </w:rPr>
+              <w:t>phone</w:t>
+            </w:r>
+          </w:p>
+        </w:tc>
+        <w:tc>
+          <w:tcPr>
+            <w:tcW w:w="0" w:type="auto"/>
+            <w:vAlign w:val="center"/>
+            <w:hideMark/>
+          </w:tcPr>
+          <w:p>
+            <w:pPr>
+              <w:spacing w:after="0" w:line="240" w:lineRule="auto"/>
+              <w:rPr>
+                <w:rFonts w:ascii="Times New Roman" w:eastAsia="Times New Roman" w:hAnsi="Times New Roman" w:cs="Times New Roman"/>
+                <w:sz w:val="24"/>
+                <w:szCs w:val="24"/>
+              </w:rPr>
+            </w:pPr>
+            <w:r>
+              <w:rPr>
+                <w:rFonts w:ascii="Times New Roman" w:eastAsia="Times New Roman" w:hAnsi="Times New Roman" w:cs="Times New Roman"/>
+                <w:sz w:val="24"/>
+                <w:szCs w:val="24"/>
+              </w:rPr>
+              <w:t>TEXT</w:t>
+            </w:r>
+          </w:p>
+        </w:tc>
+        <w:tc>
+          <w:tcPr>
+            <w:tcW w:w="0" w:type="auto"/>
+            <w:vAlign w:val="center"/>
+            <w:hideMark/>
+          </w:tcPr>
+          <w:p>
+            <w:pPr>
+              <w:spacing w:after="0" w:line="240" w:lineRule="auto"/>
+              <w:rPr>
+                <w:rFonts w:ascii="Times New Roman" w:eastAsia="Times New Roman" w:hAnsi="Times New Roman" w:cs="Times New Roman"/>
+                <w:sz w:val="24"/>
+                <w:szCs w:val="24"/>
+              </w:rPr>
+            </w:pPr>
+            <w:r>
+              <w:rPr>
+                <w:rFonts w:ascii="Times New Roman" w:eastAsia="Times New Roman" w:hAnsi="Times New Roman" w:cs="Times New Roman"/>
+                <w:sz w:val="24"/>
+                <w:szCs w:val="24"/>
+              </w:rPr>
+              <w:t>No</w:t>
+            </w:r>
+          </w:p>
+        </w:tc>
+      </w:tr>
+      <w:tr>
+        <w:trPr>
+          <w:tblCellSpacing w:w="15" w:type="dxa"/>
+        </w:trPr>
+        <w:tc>
+          <w:tcPr>
+            <w:tcW w:w="0" w:type="auto"/>
+            <w:vAlign w:val="center"/>
+            <w:hideMark/>
+          </w:tcPr>
+          <w:p>
+            <w:pPr>
+              <w:spacing w:after="0" w:line="240" w:lineRule="auto"/>
+              <w:rPr>
+                <w:rFonts w:ascii="Times New Roman" w:eastAsia="Times New Roman" w:hAnsi="Times New Roman" w:cs="Times New Roman"/>
+                <w:sz w:val="24"/>
+                <w:szCs w:val="24"/>
+              </w:rPr>
+            </w:pPr>
+            <w:r>
+              <w:rPr>
+                <w:rFonts w:ascii="Times New Roman" w:eastAsia="Times New Roman" w:hAnsi="Times New Roman" w:cs="Times New Roman"/>
+                <w:sz w:val="24"/>
+                <w:szCs w:val="24"/>
+              </w:rPr>
+              <w:t>course</w:t>
+            </w:r>
+          </w:p>
+        </w:tc>
+        <w:tc>
+          <w:tcPr>
+            <w:tcW w:w="0" w:type="auto"/>
+            <w:vAlign w:val="center"/>
+            <w:hideMark/>
+          </w:tcPr>
+          <w:p>
+            <w:pPr>
+              <w:spacing w:after="0" w:line="240" w:lineRule="auto"/>
+              <w:rPr>
+                <w:rFonts w:ascii="Times New Roman" w:eastAsia="Times New Roman" w:hAnsi="Times New Roman" w:cs="Times New Roman"/>
+                <w:sz w:val="24"/>
+                <w:szCs w:val="24"/>
+              </w:rPr>
+            </w:pPr>
+            <w:r>
+              <w:rPr>
+                <w:rFonts w:ascii="Times New Roman" w:eastAsia="Times New Roman" w:hAnsi="Times New Roman" w:cs="Times New Roman"/>
+                <w:sz w:val="24"/>
+                <w:szCs w:val="24"/>
+              </w:rPr>
+              <w:t>TEXT</w:t>
+            </w:r>
+          </w:p>
+        </w:tc>
+        <w:tc>
+          <w:tcPr>
+            <w:tcW w:w="0" w:type="auto"/>
+            <w:vAlign w:val="center"/>
+            <w:hideMark/>
+          </w:tcPr>
+          <w:p>
+            <w:pPr>
+              <w:spacing w:after="0" w:line="240" w:lineRule="auto"/>
+              <w:rPr>
+                <w:rFonts w:ascii="Times New Roman" w:eastAsia="Times New Roman" w:hAnsi="Times New Roman" w:cs="Times New Roman"/>
+                <w:sz w:val="24"/>
+                <w:szCs w:val="24"/>
+              </w:rPr>
+            </w:pPr>
+            <w:r>
+              <w:rPr>
+                <w:rFonts w:ascii="Times New Roman" w:eastAsia="Times New Roman" w:hAnsi="Times New Roman" w:cs="Times New Roman"/>
+                <w:sz w:val="24"/>
+                <w:szCs w:val="24"/>
+              </w:rPr>
+              <w:t>No</w:t>
+            </w:r>
+          </w:p>
+        </w:tc>
+      </w:tr>
+      <w:tr>
+        <w:trPr>
+          <w:tblCellSpacing w:w="15" w:type="dxa"/>
+        </w:trPr>
+        <w:tc>
+          <w:tcPr>
+            <w:tcW w:w="0" w:type="auto"/>
+            <w:vAlign w:val="center"/>
+            <w:hideMark/>
+          </w:tcPr>
+          <w:p>
+            <w:pPr>
+              <w:spacing w:after="0" w:line="240" w:lineRule="auto"/>
+              <w:rPr>
+                <w:rFonts w:ascii="Times New Roman" w:eastAsia="Times New Roman" w:hAnsi="Times New Roman" w:cs="Times New Roman"/>
+                <w:sz w:val="24"/>
+                <w:szCs w:val="24"/>
+              </w:rPr>
+            </w:pPr>
+            <w:r>
+              <w:rPr>
+                <w:rFonts w:ascii="Times New Roman" w:eastAsia="Times New Roman" w:hAnsi="Times New Roman" w:cs="Times New Roman"/>
+                <w:sz w:val="24"/>
+                <w:szCs w:val="24"/>
+              </w:rPr>
+              <w:t>password</w:t>
+            </w:r>
+          </w:p>
+        </w:tc>
+        <w:tc>
+          <w:tcPr>
+            <w:tcW w:w="0" w:type="auto"/>
+            <w:vAlign w:val="center"/>
+            <w:hideMark/>
+          </w:tcPr>
+          <w:p>
+            <w:pPr>
+              <w:spacing w:after="0" w:line="240" w:lineRule="auto"/>
+              <w:rPr>
+                <w:rFonts w:ascii="Times New Roman" w:eastAsia="Times New Roman" w:hAnsi="Times New Roman" w:cs="Times New Roman"/>
+                <w:sz w:val="24"/>
+                <w:szCs w:val="24"/>
+              </w:rPr>
+            </w:pPr>
+            <w:r>
+              <w:rPr>
+                <w:rFonts w:ascii="Times New Roman" w:eastAsia="Times New Roman" w:hAnsi="Times New Roman" w:cs="Times New Roman"/>
+                <w:sz w:val="24"/>
+                <w:szCs w:val="24"/>
+              </w:rPr>
+              <w:t>TEXT (Hashed)</w:t>
+            </w:r>
+          </w:p>
+        </w:tc>
+        <w:tc>
+          <w:tcPr>
+            <w:tcW w:w="0" w:type="auto"/>
+            <w:vAlign w:val="center"/>
+            <w:hideMark/>
+          </w:tcPr>
+          <w:p>
+            <w:pPr>
+              <w:spacing w:after="0" w:line="240" w:lineRule="auto"/>
+              <w:rPr>
+                <w:rFonts w:ascii="Times New Roman" w:eastAsia="Times New Roman" w:hAnsi="Times New Roman" w:cs="Times New Roman"/>
+                <w:sz w:val="24"/>
+                <w:szCs w:val="24"/>
+              </w:rPr>
+            </w:pPr>
+            <w:r>
+              <w:rPr>
+                <w:rFonts w:ascii="Times New Roman" w:eastAsia="Times New Roman" w:hAnsi="Times New Roman" w:cs="Times New Roman"/>
+                <w:sz w:val="24"/>
+                <w:szCs w:val="24"/>
+              </w:rPr>
+              <w:t>No</w:t>
+            </w:r>
+          </w:p>
+        </w:tc>
+      </w:tr>
+    </w:tbl>
     <w:p>
       <w:pPr>
         <w:jc w:val="both"/>
         <w:rPr>
           <w:rFonts w:ascii="Times New Roman" w:hAnsi="Times New Roman" w:cs="Times New Roman"/>
-          <w:sz w:val="24"/>
-          <w:szCs w:val="24"/>
-        </w:rPr>
-      </w:pPr>
+          <w:b/>
+          <w:bCs/>
+          <w:sz w:val="24"/>
+          <w:szCs w:val="24"/>
+        </w:rPr>
+      </w:pPr>
+      <w:r>
+        <w:rPr>
+          <w:rFonts w:ascii="Times New Roman" w:hAnsi="Times New Roman" w:cs="Times New Roman"/>
+          <w:b/>
+          <w:bCs/>
+          <w:sz w:val="24"/>
+          <w:szCs w:val="24"/>
+        </w:rPr>
+        <w:lastRenderedPageBreak/>
+        <w:t xml:space="preserve">Task 3: Mini Project – </w:t>
+      </w:r>
+      <w:r>
+        <w:rPr>
+          <w:rFonts w:ascii="Times New Roman" w:hAnsi="Times New Roman" w:cs="Times New Roman"/>
+          <w:b/>
+          <w:bCs/>
+          <w:sz w:val="24"/>
+          <w:szCs w:val="24"/>
+        </w:rPr>
+        <w:t>Cargo Track</w:t>
+      </w:r>
+      <w:r>
+        <w:rPr>
+          <w:rFonts w:ascii="Times New Roman" w:hAnsi="Times New Roman" w:cs="Times New Roman"/>
+          <w:b/>
+          <w:bCs/>
+          <w:sz w:val="24"/>
+          <w:szCs w:val="24"/>
+        </w:rPr>
+        <w:t xml:space="preserve"> Pro</w:t>
+      </w:r>
     </w:p>
     <w:p>
       <w:pPr>
         <w:jc w:val="both"/>
         <w:rPr>
           <w:rFonts w:ascii="Times New Roman" w:hAnsi="Times New Roman" w:cs="Times New Roman"/>
-          <w:sz w:val="24"/>
-          <w:szCs w:val="24"/>
-        </w:rPr>
-      </w:pPr>
-      <w:r>
-        <w:rPr>
-          <w:rFonts w:ascii="Times New Roman" w:hAnsi="Times New Roman" w:cs="Times New Roman"/>
-          <w:sz w:val="24"/>
-          <w:szCs w:val="24"/>
-        </w:rPr>
-        <w:br/>
-      </w:r>
-      <w:r>
-        <w:rPr>
-          <w:rFonts w:ascii="Times New Roman" w:hAnsi="Times New Roman" w:cs="Times New Roman"/>
-          <w:sz w:val="24"/>
-          <w:szCs w:val="24"/>
-        </w:rPr>
-        <w:br/>
-      </w:r>
-      <w:r>
-        <w:rPr>
-          <w:rFonts w:ascii="Times New Roman" w:hAnsi="Times New Roman" w:cs="Times New Roman"/>
-          <w:sz w:val="24"/>
-          <w:szCs w:val="24"/>
-        </w:rPr>
-        <w:br/>
+          <w:b/>
+          <w:bCs/>
+          <w:sz w:val="24"/>
+          <w:szCs w:val="24"/>
+        </w:rPr>
+      </w:pPr>
+      <w:r>
+        <w:rPr>
+          <w:rFonts w:ascii="Times New Roman" w:hAnsi="Times New Roman" w:cs="Times New Roman"/>
+          <w:b/>
+          <w:bCs/>
+          <w:sz w:val="24"/>
+          <w:szCs w:val="24"/>
+        </w:rPr>
+        <w:t>Storage Method Selected</w:t>
       </w:r>
     </w:p>
     <w:p>
@@ -8681,10 +10270,962 @@
       <w:r>
         <w:rPr>
           <w:rFonts w:ascii="Times New Roman" w:hAnsi="Times New Roman" w:cs="Times New Roman"/>
-          <w:sz w:val="24"/>
-          <w:szCs w:val="24"/>
-        </w:rPr>
-        <w:br w:type="page"/>
+          <w:b/>
+          <w:bCs/>
+          <w:sz w:val="24"/>
+          <w:szCs w:val="24"/>
+        </w:rPr>
+        <w:t>SQLite</w:t>
+      </w:r>
+    </w:p>
+    <w:p>
+      <w:pPr>
+        <w:jc w:val="both"/>
+        <w:rPr>
+          <w:rFonts w:ascii="Times New Roman" w:hAnsi="Times New Roman" w:cs="Times New Roman"/>
+          <w:b/>
+          <w:bCs/>
+          <w:sz w:val="24"/>
+          <w:szCs w:val="24"/>
+        </w:rPr>
+      </w:pPr>
+      <w:r>
+        <w:rPr>
+          <w:rFonts w:ascii="Times New Roman" w:hAnsi="Times New Roman" w:cs="Times New Roman"/>
+          <w:b/>
+          <w:bCs/>
+          <w:sz w:val="24"/>
+          <w:szCs w:val="24"/>
+        </w:rPr>
+        <w:t>Justification for Selecting SQLite</w:t>
+      </w:r>
+    </w:p>
+    <w:p>
+      <w:pPr>
+        <w:jc w:val="both"/>
+        <w:rPr>
+          <w:rFonts w:ascii="Times New Roman" w:hAnsi="Times New Roman" w:cs="Times New Roman"/>
+          <w:sz w:val="24"/>
+          <w:szCs w:val="24"/>
+        </w:rPr>
+      </w:pPr>
+      <w:r>
+        <w:rPr>
+          <w:rFonts w:ascii="Times New Roman" w:hAnsi="Times New Roman" w:cs="Times New Roman"/>
+          <w:sz w:val="24"/>
+          <w:szCs w:val="24"/>
+        </w:rPr>
+        <w:t xml:space="preserve">SQLite was selected as the storage method for the </w:t>
+      </w:r>
+      <w:r>
+        <w:rPr>
+          <w:rFonts w:ascii="Times New Roman" w:hAnsi="Times New Roman" w:cs="Times New Roman"/>
+          <w:sz w:val="24"/>
+          <w:szCs w:val="24"/>
+        </w:rPr>
+        <w:t>Cargo Track</w:t>
+      </w:r>
+      <w:r>
+        <w:rPr>
+          <w:rFonts w:ascii="Times New Roman" w:hAnsi="Times New Roman" w:cs="Times New Roman"/>
+          <w:sz w:val="24"/>
+          <w:szCs w:val="24"/>
+        </w:rPr>
+        <w:t xml:space="preserve"> Pro application because it offers several advantages for a mobile cargo tracking system:</w:t>
+      </w:r>
+    </w:p>
+    <w:p>
+      <w:pPr>
+        <w:numPr>
+          <w:ilvl w:val="0"/>
+          <w:numId w:val="18"/>
+        </w:numPr>
+        <w:jc w:val="both"/>
+        <w:rPr>
+          <w:rFonts w:ascii="Times New Roman" w:hAnsi="Times New Roman" w:cs="Times New Roman"/>
+          <w:sz w:val="24"/>
+          <w:szCs w:val="24"/>
+        </w:rPr>
+      </w:pPr>
+      <w:r>
+        <w:rPr>
+          <w:rFonts w:ascii="Times New Roman" w:hAnsi="Times New Roman" w:cs="Times New Roman"/>
+          <w:b/>
+          <w:bCs/>
+          <w:sz w:val="24"/>
+          <w:szCs w:val="24"/>
+        </w:rPr>
+        <w:t>Offline Capability:</w:t>
+      </w:r>
+      <w:r>
+        <w:rPr>
+          <w:rFonts w:ascii="Times New Roman" w:hAnsi="Times New Roman" w:cs="Times New Roman"/>
+          <w:sz w:val="24"/>
+          <w:szCs w:val="24"/>
+        </w:rPr>
+        <w:t xml:space="preserve"> Users can access and manage shipment information even without an internet connection.</w:t>
+      </w:r>
+    </w:p>
+    <w:p>
+      <w:pPr>
+        <w:numPr>
+          <w:ilvl w:val="0"/>
+          <w:numId w:val="18"/>
+        </w:numPr>
+        <w:jc w:val="both"/>
+        <w:rPr>
+          <w:rFonts w:ascii="Times New Roman" w:hAnsi="Times New Roman" w:cs="Times New Roman"/>
+          <w:sz w:val="24"/>
+          <w:szCs w:val="24"/>
+        </w:rPr>
+      </w:pPr>
+      <w:r>
+        <w:rPr>
+          <w:rFonts w:ascii="Times New Roman" w:hAnsi="Times New Roman" w:cs="Times New Roman"/>
+          <w:b/>
+          <w:bCs/>
+          <w:sz w:val="24"/>
+          <w:szCs w:val="24"/>
+        </w:rPr>
+        <w:t>Relational Database Structure:</w:t>
+      </w:r>
+      <w:r>
+        <w:rPr>
+          <w:rFonts w:ascii="Times New Roman" w:hAnsi="Times New Roman" w:cs="Times New Roman"/>
+          <w:sz w:val="24"/>
+          <w:szCs w:val="24"/>
+        </w:rPr>
+        <w:t xml:space="preserve"> SQLite efficiently stores related data and supports complex SQL queries.</w:t>
+      </w:r>
+    </w:p>
+    <w:p>
+      <w:pPr>
+        <w:numPr>
+          <w:ilvl w:val="0"/>
+          <w:numId w:val="18"/>
+        </w:numPr>
+        <w:jc w:val="both"/>
+        <w:rPr>
+          <w:rFonts w:ascii="Times New Roman" w:hAnsi="Times New Roman" w:cs="Times New Roman"/>
+          <w:sz w:val="24"/>
+          <w:szCs w:val="24"/>
+        </w:rPr>
+      </w:pPr>
+      <w:r>
+        <w:rPr>
+          <w:rFonts w:ascii="Times New Roman" w:hAnsi="Times New Roman" w:cs="Times New Roman"/>
+          <w:b/>
+          <w:bCs/>
+          <w:sz w:val="24"/>
+          <w:szCs w:val="24"/>
+        </w:rPr>
+        <w:t>Fast Performance:</w:t>
+      </w:r>
+      <w:r>
+        <w:rPr>
+          <w:rFonts w:ascii="Times New Roman" w:hAnsi="Times New Roman" w:cs="Times New Roman"/>
+          <w:sz w:val="24"/>
+          <w:szCs w:val="24"/>
+        </w:rPr>
+        <w:t xml:space="preserve"> Data is stored locally on the device, allowing quick retrieval and updates.</w:t>
+      </w:r>
+    </w:p>
+    <w:p>
+      <w:pPr>
+        <w:numPr>
+          <w:ilvl w:val="0"/>
+          <w:numId w:val="18"/>
+        </w:numPr>
+        <w:jc w:val="both"/>
+        <w:rPr>
+          <w:rFonts w:ascii="Times New Roman" w:hAnsi="Times New Roman" w:cs="Times New Roman"/>
+          <w:sz w:val="24"/>
+          <w:szCs w:val="24"/>
+        </w:rPr>
+      </w:pPr>
+      <w:r>
+        <w:rPr>
+          <w:rFonts w:ascii="Times New Roman" w:hAnsi="Times New Roman" w:cs="Times New Roman"/>
+          <w:b/>
+          <w:bCs/>
+          <w:sz w:val="24"/>
+          <w:szCs w:val="24"/>
+        </w:rPr>
+        <w:t>No Dedicated Server Required:</w:t>
+      </w:r>
+      <w:r>
+        <w:rPr>
+          <w:rFonts w:ascii="Times New Roman" w:hAnsi="Times New Roman" w:cs="Times New Roman"/>
+          <w:sz w:val="24"/>
+          <w:szCs w:val="24"/>
+        </w:rPr>
+        <w:t xml:space="preserve"> SQLite is embedded within the application, making it easy to deploy and maintain.</w:t>
+      </w:r>
+    </w:p>
+    <w:p>
+      <w:pPr>
+        <w:numPr>
+          <w:ilvl w:val="0"/>
+          <w:numId w:val="18"/>
+        </w:numPr>
+        <w:jc w:val="both"/>
+        <w:rPr>
+          <w:rFonts w:ascii="Times New Roman" w:hAnsi="Times New Roman" w:cs="Times New Roman"/>
+          <w:sz w:val="24"/>
+          <w:szCs w:val="24"/>
+        </w:rPr>
+      </w:pPr>
+      <w:r>
+        <w:rPr>
+          <w:rFonts w:ascii="Times New Roman" w:hAnsi="Times New Roman" w:cs="Times New Roman"/>
+          <w:b/>
+          <w:bCs/>
+          <w:sz w:val="24"/>
+          <w:szCs w:val="24"/>
+        </w:rPr>
+        <w:t>Secure and Reliable:</w:t>
+      </w:r>
+      <w:r>
+        <w:rPr>
+          <w:rFonts w:ascii="Times New Roman" w:hAnsi="Times New Roman" w:cs="Times New Roman"/>
+          <w:sz w:val="24"/>
+          <w:szCs w:val="24"/>
+        </w:rPr>
+        <w:t xml:space="preserve"> It provides a stable and lightweight solution for managing application data.</w:t>
+      </w:r>
+    </w:p>
+    <w:p>
+      <w:pPr>
+        <w:jc w:val="both"/>
+        <w:rPr>
+          <w:rFonts w:ascii="Times New Roman" w:hAnsi="Times New Roman" w:cs="Times New Roman"/>
+          <w:sz w:val="24"/>
+          <w:szCs w:val="24"/>
+        </w:rPr>
+      </w:pPr>
+    </w:p>
+    <w:p>
+      <w:pPr>
+        <w:jc w:val="both"/>
+        <w:rPr>
+          <w:rFonts w:ascii="Times New Roman" w:hAnsi="Times New Roman" w:cs="Times New Roman"/>
+          <w:b/>
+          <w:bCs/>
+          <w:sz w:val="24"/>
+          <w:szCs w:val="24"/>
+        </w:rPr>
+      </w:pPr>
+    </w:p>
+    <w:p>
+      <w:pPr>
+        <w:jc w:val="both"/>
+        <w:rPr>
+          <w:rFonts w:ascii="Times New Roman" w:hAnsi="Times New Roman" w:cs="Times New Roman"/>
+          <w:b/>
+          <w:bCs/>
+          <w:sz w:val="24"/>
+          <w:szCs w:val="24"/>
+        </w:rPr>
+      </w:pPr>
+      <w:r>
+        <w:rPr>
+          <w:rFonts w:ascii="Times New Roman" w:hAnsi="Times New Roman" w:cs="Times New Roman"/>
+          <w:b/>
+          <w:bCs/>
+          <w:sz w:val="24"/>
+          <w:szCs w:val="24"/>
+        </w:rPr>
+        <w:t>CRUD Operations Implemented</w:t>
+      </w:r>
+    </w:p>
+    <w:tbl>
+      <w:tblPr>
+        <w:tblW w:w="0" w:type="auto"/>
+        <w:tblCellSpacing w:w="15" w:type="dxa"/>
+        <w:tblBorders>
+          <w:top w:val="single" w:sz="4" w:space="0" w:color="auto"/>
+          <w:left w:val="single" w:sz="4" w:space="0" w:color="auto"/>
+          <w:bottom w:val="single" w:sz="4" w:space="0" w:color="auto"/>
+          <w:right w:val="single" w:sz="4" w:space="0" w:color="auto"/>
+          <w:insideH w:val="single" w:sz="4" w:space="0" w:color="auto"/>
+          <w:insideV w:val="single" w:sz="4" w:space="0" w:color="auto"/>
+        </w:tblBorders>
+        <w:tblCellMar>
+          <w:top w:w="15" w:type="dxa"/>
+          <w:left w:w="15" w:type="dxa"/>
+          <w:bottom w:w="15" w:type="dxa"/>
+          <w:right w:w="15" w:type="dxa"/>
+        </w:tblCellMar>
+        <w:tblLook w:val="04A0" w:firstRow="1" w:lastRow="0" w:firstColumn="1" w:lastColumn="0" w:noHBand="0" w:noVBand="1"/>
+      </w:tblPr>
+      <w:tblGrid>
+        <w:gridCol w:w="1149"/>
+        <w:gridCol w:w="1927"/>
+        <w:gridCol w:w="1188"/>
+      </w:tblGrid>
+      <w:tr>
+        <w:trPr>
+          <w:tblHeader/>
+          <w:tblCellSpacing w:w="15" w:type="dxa"/>
+        </w:trPr>
+        <w:tc>
+          <w:tcPr>
+            <w:tcW w:w="0" w:type="auto"/>
+            <w:vAlign w:val="center"/>
+            <w:hideMark/>
+          </w:tcPr>
+          <w:p>
+            <w:pPr>
+              <w:jc w:val="both"/>
+              <w:rPr>
+                <w:rFonts w:ascii="Times New Roman" w:hAnsi="Times New Roman" w:cs="Times New Roman"/>
+                <w:b/>
+                <w:bCs/>
+                <w:sz w:val="24"/>
+                <w:szCs w:val="24"/>
+              </w:rPr>
+            </w:pPr>
+            <w:r>
+              <w:rPr>
+                <w:rFonts w:ascii="Times New Roman" w:hAnsi="Times New Roman" w:cs="Times New Roman"/>
+                <w:b/>
+                <w:bCs/>
+                <w:sz w:val="24"/>
+                <w:szCs w:val="24"/>
+              </w:rPr>
+              <w:t>Operation</w:t>
+            </w:r>
+          </w:p>
+        </w:tc>
+        <w:tc>
+          <w:tcPr>
+            <w:tcW w:w="0" w:type="auto"/>
+            <w:vAlign w:val="center"/>
+            <w:hideMark/>
+          </w:tcPr>
+          <w:p>
+            <w:pPr>
+              <w:jc w:val="both"/>
+              <w:rPr>
+                <w:rFonts w:ascii="Times New Roman" w:hAnsi="Times New Roman" w:cs="Times New Roman"/>
+                <w:b/>
+                <w:bCs/>
+                <w:sz w:val="24"/>
+                <w:szCs w:val="24"/>
+              </w:rPr>
+            </w:pPr>
+            <w:r>
+              <w:rPr>
+                <w:rFonts w:ascii="Times New Roman" w:hAnsi="Times New Roman" w:cs="Times New Roman"/>
+                <w:b/>
+                <w:bCs/>
+                <w:sz w:val="24"/>
+                <w:szCs w:val="24"/>
+              </w:rPr>
+              <w:t>Function</w:t>
+            </w:r>
+          </w:p>
+        </w:tc>
+        <w:tc>
+          <w:tcPr>
+            <w:tcW w:w="0" w:type="auto"/>
+            <w:vAlign w:val="center"/>
+            <w:hideMark/>
+          </w:tcPr>
+          <w:p>
+            <w:pPr>
+              <w:jc w:val="both"/>
+              <w:rPr>
+                <w:rFonts w:ascii="Times New Roman" w:hAnsi="Times New Roman" w:cs="Times New Roman"/>
+                <w:b/>
+                <w:bCs/>
+                <w:sz w:val="24"/>
+                <w:szCs w:val="24"/>
+              </w:rPr>
+            </w:pPr>
+            <w:r>
+              <w:rPr>
+                <w:rFonts w:ascii="Times New Roman" w:hAnsi="Times New Roman" w:cs="Times New Roman"/>
+                <w:b/>
+                <w:bCs/>
+                <w:sz w:val="24"/>
+                <w:szCs w:val="24"/>
+              </w:rPr>
+              <w:t>Status</w:t>
+            </w:r>
+          </w:p>
+        </w:tc>
+      </w:tr>
+      <w:tr>
+        <w:trPr>
+          <w:tblCellSpacing w:w="15" w:type="dxa"/>
+        </w:trPr>
+        <w:tc>
+          <w:tcPr>
+            <w:tcW w:w="0" w:type="auto"/>
+            <w:vAlign w:val="center"/>
+            <w:hideMark/>
+          </w:tcPr>
+          <w:p>
+            <w:pPr>
+              <w:jc w:val="both"/>
+              <w:rPr>
+                <w:rFonts w:ascii="Times New Roman" w:hAnsi="Times New Roman" w:cs="Times New Roman"/>
+                <w:sz w:val="24"/>
+                <w:szCs w:val="24"/>
+              </w:rPr>
+            </w:pPr>
+            <w:r>
+              <w:rPr>
+                <w:rFonts w:ascii="Times New Roman" w:hAnsi="Times New Roman" w:cs="Times New Roman"/>
+                <w:sz w:val="24"/>
+                <w:szCs w:val="24"/>
+              </w:rPr>
+              <w:t>CREATE</w:t>
+            </w:r>
+          </w:p>
+        </w:tc>
+        <w:tc>
+          <w:tcPr>
+            <w:tcW w:w="0" w:type="auto"/>
+            <w:vAlign w:val="center"/>
+            <w:hideMark/>
+          </w:tcPr>
+          <w:p>
+            <w:pPr>
+              <w:jc w:val="both"/>
+              <w:rPr>
+                <w:rFonts w:ascii="Times New Roman" w:hAnsi="Times New Roman" w:cs="Times New Roman"/>
+                <w:sz w:val="24"/>
+                <w:szCs w:val="24"/>
+              </w:rPr>
+            </w:pPr>
+            <w:r>
+              <w:rPr>
+                <w:rFonts w:ascii="Times New Roman" w:hAnsi="Times New Roman" w:cs="Times New Roman"/>
+                <w:sz w:val="24"/>
+                <w:szCs w:val="24"/>
+              </w:rPr>
+              <w:t>addShipment (</w:t>
+            </w:r>
+            <w:r>
+              <w:rPr>
+                <w:rFonts w:ascii="Times New Roman" w:hAnsi="Times New Roman" w:cs="Times New Roman"/>
+                <w:sz w:val="24"/>
+                <w:szCs w:val="24"/>
+              </w:rPr>
+              <w:t>)</w:t>
+            </w:r>
+          </w:p>
+        </w:tc>
+        <w:tc>
+          <w:tcPr>
+            <w:tcW w:w="0" w:type="auto"/>
+            <w:vAlign w:val="center"/>
+            <w:hideMark/>
+          </w:tcPr>
+          <w:p>
+            <w:pPr>
+              <w:jc w:val="both"/>
+              <w:rPr>
+                <w:rFonts w:ascii="Times New Roman" w:hAnsi="Times New Roman" w:cs="Times New Roman"/>
+                <w:sz w:val="24"/>
+                <w:szCs w:val="24"/>
+              </w:rPr>
+            </w:pPr>
+            <w:r>
+              <w:rPr>
+                <w:rFonts w:ascii="Segoe UI Symbol" w:hAnsi="Segoe UI Symbol" w:cs="Segoe UI Symbol"/>
+                <w:sz w:val="24"/>
+                <w:szCs w:val="24"/>
+              </w:rPr>
+              <w:t>✓</w:t>
+            </w:r>
+            <w:r>
+              <w:rPr>
+                <w:rFonts w:ascii="Times New Roman" w:hAnsi="Times New Roman" w:cs="Times New Roman"/>
+                <w:sz w:val="24"/>
+                <w:szCs w:val="24"/>
+              </w:rPr>
+              <w:t xml:space="preserve"> Working</w:t>
+            </w:r>
+          </w:p>
+        </w:tc>
+      </w:tr>
+      <w:tr>
+        <w:trPr>
+          <w:tblCellSpacing w:w="15" w:type="dxa"/>
+        </w:trPr>
+        <w:tc>
+          <w:tcPr>
+            <w:tcW w:w="0" w:type="auto"/>
+            <w:vAlign w:val="center"/>
+            <w:hideMark/>
+          </w:tcPr>
+          <w:p>
+            <w:pPr>
+              <w:jc w:val="both"/>
+              <w:rPr>
+                <w:rFonts w:ascii="Times New Roman" w:hAnsi="Times New Roman" w:cs="Times New Roman"/>
+                <w:sz w:val="24"/>
+                <w:szCs w:val="24"/>
+              </w:rPr>
+            </w:pPr>
+            <w:r>
+              <w:rPr>
+                <w:rFonts w:ascii="Times New Roman" w:hAnsi="Times New Roman" w:cs="Times New Roman"/>
+                <w:sz w:val="24"/>
+                <w:szCs w:val="24"/>
+              </w:rPr>
+              <w:t>READ</w:t>
+            </w:r>
+          </w:p>
+        </w:tc>
+        <w:tc>
+          <w:tcPr>
+            <w:tcW w:w="0" w:type="auto"/>
+            <w:vAlign w:val="center"/>
+            <w:hideMark/>
+          </w:tcPr>
+          <w:p>
+            <w:pPr>
+              <w:jc w:val="both"/>
+              <w:rPr>
+                <w:rFonts w:ascii="Times New Roman" w:hAnsi="Times New Roman" w:cs="Times New Roman"/>
+                <w:sz w:val="24"/>
+                <w:szCs w:val="24"/>
+              </w:rPr>
+            </w:pPr>
+            <w:r>
+              <w:rPr>
+                <w:rFonts w:ascii="Times New Roman" w:hAnsi="Times New Roman" w:cs="Times New Roman"/>
+                <w:sz w:val="24"/>
+                <w:szCs w:val="24"/>
+              </w:rPr>
+              <w:t>getAllShipments (</w:t>
+            </w:r>
+            <w:r>
+              <w:rPr>
+                <w:rFonts w:ascii="Times New Roman" w:hAnsi="Times New Roman" w:cs="Times New Roman"/>
+                <w:sz w:val="24"/>
+                <w:szCs w:val="24"/>
+              </w:rPr>
+              <w:t>)</w:t>
+            </w:r>
+          </w:p>
+        </w:tc>
+        <w:tc>
+          <w:tcPr>
+            <w:tcW w:w="0" w:type="auto"/>
+            <w:vAlign w:val="center"/>
+            <w:hideMark/>
+          </w:tcPr>
+          <w:p>
+            <w:pPr>
+              <w:jc w:val="both"/>
+              <w:rPr>
+                <w:rFonts w:ascii="Times New Roman" w:hAnsi="Times New Roman" w:cs="Times New Roman"/>
+                <w:sz w:val="24"/>
+                <w:szCs w:val="24"/>
+              </w:rPr>
+            </w:pPr>
+            <w:r>
+              <w:rPr>
+                <w:rFonts w:ascii="Segoe UI Symbol" w:hAnsi="Segoe UI Symbol" w:cs="Segoe UI Symbol"/>
+                <w:sz w:val="24"/>
+                <w:szCs w:val="24"/>
+              </w:rPr>
+              <w:t>✓</w:t>
+            </w:r>
+            <w:r>
+              <w:rPr>
+                <w:rFonts w:ascii="Times New Roman" w:hAnsi="Times New Roman" w:cs="Times New Roman"/>
+                <w:sz w:val="24"/>
+                <w:szCs w:val="24"/>
+              </w:rPr>
+              <w:t xml:space="preserve"> Working</w:t>
+            </w:r>
+          </w:p>
+        </w:tc>
+      </w:tr>
+      <w:tr>
+        <w:trPr>
+          <w:tblCellSpacing w:w="15" w:type="dxa"/>
+        </w:trPr>
+        <w:tc>
+          <w:tcPr>
+            <w:tcW w:w="0" w:type="auto"/>
+            <w:vAlign w:val="center"/>
+            <w:hideMark/>
+          </w:tcPr>
+          <w:p>
+            <w:pPr>
+              <w:jc w:val="both"/>
+              <w:rPr>
+                <w:rFonts w:ascii="Times New Roman" w:hAnsi="Times New Roman" w:cs="Times New Roman"/>
+                <w:sz w:val="24"/>
+                <w:szCs w:val="24"/>
+              </w:rPr>
+            </w:pPr>
+            <w:r>
+              <w:rPr>
+                <w:rFonts w:ascii="Times New Roman" w:hAnsi="Times New Roman" w:cs="Times New Roman"/>
+                <w:sz w:val="24"/>
+                <w:szCs w:val="24"/>
+              </w:rPr>
+              <w:t>UPDATE</w:t>
+            </w:r>
+          </w:p>
+        </w:tc>
+        <w:tc>
+          <w:tcPr>
+            <w:tcW w:w="0" w:type="auto"/>
+            <w:vAlign w:val="center"/>
+            <w:hideMark/>
+          </w:tcPr>
+          <w:p>
+            <w:pPr>
+              <w:jc w:val="both"/>
+              <w:rPr>
+                <w:rFonts w:ascii="Times New Roman" w:hAnsi="Times New Roman" w:cs="Times New Roman"/>
+                <w:sz w:val="24"/>
+                <w:szCs w:val="24"/>
+              </w:rPr>
+            </w:pPr>
+            <w:r>
+              <w:rPr>
+                <w:rFonts w:ascii="Times New Roman" w:hAnsi="Times New Roman" w:cs="Times New Roman"/>
+                <w:sz w:val="24"/>
+                <w:szCs w:val="24"/>
+              </w:rPr>
+              <w:t>updateShipment (</w:t>
+            </w:r>
+            <w:r>
+              <w:rPr>
+                <w:rFonts w:ascii="Times New Roman" w:hAnsi="Times New Roman" w:cs="Times New Roman"/>
+                <w:sz w:val="24"/>
+                <w:szCs w:val="24"/>
+              </w:rPr>
+              <w:t>)</w:t>
+            </w:r>
+          </w:p>
+        </w:tc>
+        <w:tc>
+          <w:tcPr>
+            <w:tcW w:w="0" w:type="auto"/>
+            <w:vAlign w:val="center"/>
+            <w:hideMark/>
+          </w:tcPr>
+          <w:p>
+            <w:pPr>
+              <w:jc w:val="both"/>
+              <w:rPr>
+                <w:rFonts w:ascii="Times New Roman" w:hAnsi="Times New Roman" w:cs="Times New Roman"/>
+                <w:sz w:val="24"/>
+                <w:szCs w:val="24"/>
+              </w:rPr>
+            </w:pPr>
+            <w:r>
+              <w:rPr>
+                <w:rFonts w:ascii="Segoe UI Symbol" w:hAnsi="Segoe UI Symbol" w:cs="Segoe UI Symbol"/>
+                <w:sz w:val="24"/>
+                <w:szCs w:val="24"/>
+              </w:rPr>
+              <w:t>✓</w:t>
+            </w:r>
+            <w:r>
+              <w:rPr>
+                <w:rFonts w:ascii="Times New Roman" w:hAnsi="Times New Roman" w:cs="Times New Roman"/>
+                <w:sz w:val="24"/>
+                <w:szCs w:val="24"/>
+              </w:rPr>
+              <w:t xml:space="preserve"> Working</w:t>
+            </w:r>
+          </w:p>
+        </w:tc>
+      </w:tr>
+      <w:tr>
+        <w:trPr>
+          <w:tblCellSpacing w:w="15" w:type="dxa"/>
+        </w:trPr>
+        <w:tc>
+          <w:tcPr>
+            <w:tcW w:w="0" w:type="auto"/>
+            <w:vAlign w:val="center"/>
+            <w:hideMark/>
+          </w:tcPr>
+          <w:p>
+            <w:pPr>
+              <w:jc w:val="both"/>
+              <w:rPr>
+                <w:rFonts w:ascii="Times New Roman" w:hAnsi="Times New Roman" w:cs="Times New Roman"/>
+                <w:sz w:val="24"/>
+                <w:szCs w:val="24"/>
+              </w:rPr>
+            </w:pPr>
+            <w:r>
+              <w:rPr>
+                <w:rFonts w:ascii="Times New Roman" w:hAnsi="Times New Roman" w:cs="Times New Roman"/>
+                <w:sz w:val="24"/>
+                <w:szCs w:val="24"/>
+              </w:rPr>
+              <w:t>DELETE</w:t>
+            </w:r>
+          </w:p>
+        </w:tc>
+        <w:tc>
+          <w:tcPr>
+            <w:tcW w:w="0" w:type="auto"/>
+            <w:vAlign w:val="center"/>
+            <w:hideMark/>
+          </w:tcPr>
+          <w:p>
+            <w:pPr>
+              <w:jc w:val="both"/>
+              <w:rPr>
+                <w:rFonts w:ascii="Times New Roman" w:hAnsi="Times New Roman" w:cs="Times New Roman"/>
+                <w:sz w:val="24"/>
+                <w:szCs w:val="24"/>
+              </w:rPr>
+            </w:pPr>
+            <w:r>
+              <w:rPr>
+                <w:rFonts w:ascii="Times New Roman" w:hAnsi="Times New Roman" w:cs="Times New Roman"/>
+                <w:sz w:val="24"/>
+                <w:szCs w:val="24"/>
+              </w:rPr>
+              <w:t>deleteShipment (</w:t>
+            </w:r>
+            <w:r>
+              <w:rPr>
+                <w:rFonts w:ascii="Times New Roman" w:hAnsi="Times New Roman" w:cs="Times New Roman"/>
+                <w:sz w:val="24"/>
+                <w:szCs w:val="24"/>
+              </w:rPr>
+              <w:t>)</w:t>
+            </w:r>
+          </w:p>
+        </w:tc>
+        <w:tc>
+          <w:tcPr>
+            <w:tcW w:w="0" w:type="auto"/>
+            <w:vAlign w:val="center"/>
+            <w:hideMark/>
+          </w:tcPr>
+          <w:p>
+            <w:pPr>
+              <w:jc w:val="both"/>
+              <w:rPr>
+                <w:rFonts w:ascii="Times New Roman" w:hAnsi="Times New Roman" w:cs="Times New Roman"/>
+                <w:sz w:val="24"/>
+                <w:szCs w:val="24"/>
+              </w:rPr>
+            </w:pPr>
+            <w:r>
+              <w:rPr>
+                <w:rFonts w:ascii="Segoe UI Symbol" w:hAnsi="Segoe UI Symbol" w:cs="Segoe UI Symbol"/>
+                <w:sz w:val="24"/>
+                <w:szCs w:val="24"/>
+              </w:rPr>
+              <w:t>✓</w:t>
+            </w:r>
+            <w:r>
+              <w:rPr>
+                <w:rFonts w:ascii="Times New Roman" w:hAnsi="Times New Roman" w:cs="Times New Roman"/>
+                <w:sz w:val="24"/>
+                <w:szCs w:val="24"/>
+              </w:rPr>
+              <w:t xml:space="preserve"> Working</w:t>
+            </w:r>
+          </w:p>
+        </w:tc>
+      </w:tr>
+      <w:tr>
+        <w:trPr>
+          <w:tblCellSpacing w:w="15" w:type="dxa"/>
+        </w:trPr>
+        <w:tc>
+          <w:tcPr>
+            <w:tcW w:w="0" w:type="auto"/>
+            <w:vAlign w:val="center"/>
+            <w:hideMark/>
+          </w:tcPr>
+          <w:p>
+            <w:pPr>
+              <w:jc w:val="both"/>
+              <w:rPr>
+                <w:rFonts w:ascii="Times New Roman" w:hAnsi="Times New Roman" w:cs="Times New Roman"/>
+                <w:sz w:val="24"/>
+                <w:szCs w:val="24"/>
+              </w:rPr>
+            </w:pPr>
+            <w:r>
+              <w:rPr>
+                <w:rFonts w:ascii="Times New Roman" w:hAnsi="Times New Roman" w:cs="Times New Roman"/>
+                <w:sz w:val="24"/>
+                <w:szCs w:val="24"/>
+              </w:rPr>
+              <w:t>SEARCH</w:t>
+            </w:r>
+          </w:p>
+        </w:tc>
+        <w:tc>
+          <w:tcPr>
+            <w:tcW w:w="0" w:type="auto"/>
+            <w:vAlign w:val="center"/>
+            <w:hideMark/>
+          </w:tcPr>
+          <w:p>
+            <w:pPr>
+              <w:jc w:val="both"/>
+              <w:rPr>
+                <w:rFonts w:ascii="Times New Roman" w:hAnsi="Times New Roman" w:cs="Times New Roman"/>
+                <w:sz w:val="24"/>
+                <w:szCs w:val="24"/>
+              </w:rPr>
+            </w:pPr>
+            <w:r>
+              <w:rPr>
+                <w:rFonts w:ascii="Times New Roman" w:hAnsi="Times New Roman" w:cs="Times New Roman"/>
+                <w:sz w:val="24"/>
+                <w:szCs w:val="24"/>
+              </w:rPr>
+              <w:t>searchShipments (</w:t>
+            </w:r>
+            <w:r>
+              <w:rPr>
+                <w:rFonts w:ascii="Times New Roman" w:hAnsi="Times New Roman" w:cs="Times New Roman"/>
+                <w:sz w:val="24"/>
+                <w:szCs w:val="24"/>
+              </w:rPr>
+              <w:t>)</w:t>
+            </w:r>
+          </w:p>
+        </w:tc>
+        <w:tc>
+          <w:tcPr>
+            <w:tcW w:w="0" w:type="auto"/>
+            <w:vAlign w:val="center"/>
+            <w:hideMark/>
+          </w:tcPr>
+          <w:p>
+            <w:pPr>
+              <w:jc w:val="both"/>
+              <w:rPr>
+                <w:rFonts w:ascii="Times New Roman" w:hAnsi="Times New Roman" w:cs="Times New Roman"/>
+                <w:sz w:val="24"/>
+                <w:szCs w:val="24"/>
+              </w:rPr>
+            </w:pPr>
+            <w:r>
+              <w:rPr>
+                <w:rFonts w:ascii="Segoe UI Symbol" w:hAnsi="Segoe UI Symbol" w:cs="Segoe UI Symbol"/>
+                <w:sz w:val="24"/>
+                <w:szCs w:val="24"/>
+              </w:rPr>
+              <w:t>✓</w:t>
+            </w:r>
+            <w:r>
+              <w:rPr>
+                <w:rFonts w:ascii="Times New Roman" w:hAnsi="Times New Roman" w:cs="Times New Roman"/>
+                <w:sz w:val="24"/>
+                <w:szCs w:val="24"/>
+              </w:rPr>
+              <w:t xml:space="preserve"> Working</w:t>
+            </w:r>
+          </w:p>
+        </w:tc>
+      </w:tr>
+    </w:tbl>
+    <w:p>
+      <w:pPr>
+        <w:jc w:val="both"/>
+        <w:rPr>
+          <w:rFonts w:ascii="Times New Roman" w:hAnsi="Times New Roman" w:cs="Times New Roman"/>
+          <w:sz w:val="24"/>
+          <w:szCs w:val="24"/>
+        </w:rPr>
+      </w:pPr>
+      <w:r>
+        <w:rPr>
+          <w:rFonts w:ascii="Times New Roman" w:hAnsi="Times New Roman" w:cs="Times New Roman"/>
+          <w:sz w:val="24"/>
+          <w:szCs w:val="24"/>
+        </w:rPr>
+        <w:lastRenderedPageBreak/>
+        <w:t>The application supports all fundamental database operations (CRUD), allowing users to create new shipment records, retrieve existing records, update shipment details, delete records when necessary, and search for shipments using the tracking number or other relevant information.</w:t>
+      </w:r>
+    </w:p>
+    <w:p>
+      <w:pPr>
+        <w:jc w:val="both"/>
+        <w:rPr>
+          <w:rFonts w:ascii="Times New Roman" w:hAnsi="Times New Roman" w:cs="Times New Roman"/>
+          <w:sz w:val="24"/>
+          <w:szCs w:val="24"/>
+        </w:rPr>
+      </w:pPr>
+    </w:p>
+    <w:p>
+      <w:pPr>
+        <w:jc w:val="both"/>
+        <w:rPr>
+          <w:rFonts w:ascii="Times New Roman" w:hAnsi="Times New Roman" w:cs="Times New Roman"/>
+          <w:b/>
+          <w:bCs/>
+          <w:sz w:val="24"/>
+          <w:szCs w:val="24"/>
+        </w:rPr>
+      </w:pPr>
+      <w:r>
+        <w:rPr>
+          <w:rFonts w:ascii="Times New Roman" w:hAnsi="Times New Roman" w:cs="Times New Roman"/>
+          <w:b/>
+          <w:bCs/>
+          <w:sz w:val="24"/>
+          <w:szCs w:val="24"/>
+        </w:rPr>
+        <w:t>Password Security</w:t>
+      </w:r>
+    </w:p>
+    <w:p>
+      <w:pPr>
+        <w:jc w:val="both"/>
+        <w:rPr>
+          <w:rFonts w:ascii="Times New Roman" w:hAnsi="Times New Roman" w:cs="Times New Roman"/>
+          <w:b/>
+          <w:bCs/>
+          <w:sz w:val="24"/>
+          <w:szCs w:val="24"/>
+        </w:rPr>
+      </w:pPr>
+      <w:r>
+        <w:rPr>
+          <w:rFonts w:ascii="Times New Roman" w:hAnsi="Times New Roman" w:cs="Times New Roman"/>
+          <w:b/>
+          <w:bCs/>
+          <w:sz w:val="24"/>
+          <w:szCs w:val="24"/>
+        </w:rPr>
+        <w:t>Current Implementation</w:t>
+      </w:r>
+    </w:p>
+    <w:p>
+      <w:pPr>
+        <w:jc w:val="both"/>
+        <w:rPr>
+          <w:rFonts w:ascii="Times New Roman" w:hAnsi="Times New Roman" w:cs="Times New Roman"/>
+          <w:sz w:val="24"/>
+          <w:szCs w:val="24"/>
+        </w:rPr>
+      </w:pPr>
+      <w:r>
+        <w:rPr>
+          <w:rFonts w:ascii="Times New Roman" w:hAnsi="Times New Roman" w:cs="Times New Roman"/>
+          <w:sz w:val="24"/>
+          <w:szCs w:val="24"/>
+        </w:rPr>
+        <w:t>For demonstration and academic purposes, user passwords are currently stored in plain text.</w:t>
       </w:r>
     </w:p>
     <w:p>
@@ -8950,6 +11491,155 @@
     </w:lvl>
   </w:abstractNum>
   <w:abstractNum w:abstractNumId="9" w15:restartNumberingAfterBreak="0">
+    <w:nsid w:val="05302898"/>
+    <w:multiLevelType w:val="multilevel"/>
+    <w:tmpl w:val="F818718A"/>
+    <w:lvl w:ilvl="0">
+      <w:start w:val="1"/>
+      <w:numFmt w:val="bullet"/>
+      <w:lvlText w:val=""/>
+      <w:lvlJc w:val="left"/>
+      <w:pPr>
+        <w:tabs>
+          <w:tab w:val="num" w:pos="720"/>
+        </w:tabs>
+        <w:ind w:left="720" w:hanging="360"/>
+      </w:pPr>
+      <w:rPr>
+        <w:rFonts w:ascii="Symbol" w:hAnsi="Symbol" w:hint="default"/>
+        <w:sz w:val="20"/>
+      </w:rPr>
+    </w:lvl>
+    <w:lvl w:ilvl="1" w:tentative="1">
+      <w:start w:val="1"/>
+      <w:numFmt w:val="bullet"/>
+      <w:lvlText w:val="o"/>
+      <w:lvlJc w:val="left"/>
+      <w:pPr>
+        <w:tabs>
+          <w:tab w:val="num" w:pos="1440"/>
+        </w:tabs>
+        <w:ind w:left="1440" w:hanging="360"/>
+      </w:pPr>
+      <w:rPr>
+        <w:rFonts w:ascii="Courier New" w:hAnsi="Courier New" w:hint="default"/>
+        <w:sz w:val="20"/>
+      </w:rPr>
+    </w:lvl>
+    <w:lvl w:ilvl="2" w:tentative="1">
+      <w:start w:val="1"/>
+      <w:numFmt w:val="bullet"/>
+      <w:lvlText w:val=""/>
+      <w:lvlJc w:val="left"/>
+      <w:pPr>
+        <w:tabs>
+          <w:tab w:val="num" w:pos="2160"/>
+        </w:tabs>
+        <w:ind w:left="2160" w:hanging="360"/>
+      </w:pPr>
+      <w:rPr>
+        <w:rFonts w:ascii="Wingdings" w:hAnsi="Wingdings" w:hint="default"/>
+        <w:sz w:val="20"/>
+      </w:rPr>
+    </w:lvl>
+    <w:lvl w:ilvl="3" w:tentative="1">
+      <w:start w:val="1"/>
+      <w:numFmt w:val="bullet"/>
+      <w:lvlText w:val=""/>
+      <w:lvlJc w:val="left"/>
+      <w:pPr>
+        <w:tabs>
+          <w:tab w:val="num" w:pos="2880"/>
+        </w:tabs>
+        <w:ind w:left="2880" w:hanging="360"/>
+      </w:pPr>
+      <w:rPr>
+        <w:rFonts w:ascii="Wingdings" w:hAnsi="Wingdings" w:hint="default"/>
+        <w:sz w:val="20"/>
+      </w:rPr>
+    </w:lvl>
+    <w:lvl w:ilvl="4" w:tentative="1">
+      <w:start w:val="1"/>
+      <w:numFmt w:val="bullet"/>
+      <w:lvlText w:val=""/>
+      <w:lvlJc w:val="left"/>
+      <w:pPr>
+        <w:tabs>
+          <w:tab w:val="num" w:pos="3600"/>
+        </w:tabs>
+        <w:ind w:left="3600" w:hanging="360"/>
+      </w:pPr>
+      <w:rPr>
+        <w:rFonts w:ascii="Wingdings" w:hAnsi="Wingdings" w:hint="default"/>
+        <w:sz w:val="20"/>
+      </w:rPr>
+    </w:lvl>
+    <w:lvl w:ilvl="5" w:tentative="1">
+      <w:start w:val="1"/>
+      <w:numFmt w:val="bullet"/>
+      <w:lvlText w:val=""/>
+      <w:lvlJc w:val="left"/>
+      <w:pPr>
+        <w:tabs>
+          <w:tab w:val="num" w:pos="4320"/>
+        </w:tabs>
+        <w:ind w:left="4320" w:hanging="360"/>
+      </w:pPr>
+      <w:rPr>
+        <w:rFonts w:ascii="Wingdings" w:hAnsi="Wingdings" w:hint="default"/>
+        <w:sz w:val="20"/>
+      </w:rPr>
+    </w:lvl>
+    <w:lvl w:ilvl="6" w:tentative="1">
+      <w:start w:val="1"/>
+      <w:numFmt w:val="bullet"/>
+      <w:lvlText w:val=""/>
+      <w:lvlJc w:val="left"/>
+      <w:pPr>
+        <w:tabs>
+          <w:tab w:val="num" w:pos="5040"/>
+        </w:tabs>
+        <w:ind w:left="5040" w:hanging="360"/>
+      </w:pPr>
+      <w:rPr>
+        <w:rFonts w:ascii="Wingdings" w:hAnsi="Wingdings" w:hint="default"/>
+        <w:sz w:val="20"/>
+      </w:rPr>
+    </w:lvl>
+    <w:lvl w:ilvl="7" w:tentative="1">
+      <w:start w:val="1"/>
+      <w:numFmt w:val="bullet"/>
+      <w:lvlText w:val=""/>
+      <w:lvlJc w:val="left"/>
+      <w:pPr>
+        <w:tabs>
+          <w:tab w:val="num" w:pos="5760"/>
+        </w:tabs>
+        <w:ind w:left="5760" w:hanging="360"/>
+      </w:pPr>
+      <w:rPr>
+        <w:rFonts w:ascii="Wingdings" w:hAnsi="Wingdings" w:hint="default"/>
+        <w:sz w:val="20"/>
+      </w:rPr>
+    </w:lvl>
+    <w:lvl w:ilvl="8" w:tentative="1">
+      <w:start w:val="1"/>
+      <w:numFmt w:val="bullet"/>
+      <w:lvlText w:val=""/>
+      <w:lvlJc w:val="left"/>
+      <w:pPr>
+        <w:tabs>
+          <w:tab w:val="num" w:pos="6480"/>
+        </w:tabs>
+        <w:ind w:left="6480" w:hanging="360"/>
+      </w:pPr>
+      <w:rPr>
+        <w:rFonts w:ascii="Wingdings" w:hAnsi="Wingdings" w:hint="default"/>
+        <w:sz w:val="20"/>
+      </w:rPr>
+    </w:lvl>
+  </w:abstractNum>
+  <w:abstractNum w:abstractNumId="10" w15:restartNumberingAfterBreak="0">
     <w:nsid w:val="096F0EB5"/>
     <w:multiLevelType w:val="hybridMultilevel"/>
     <w:tmpl w:val="5A001FAC"/>
@@ -9039,7 +11729,7 @@
       </w:pPr>
     </w:lvl>
   </w:abstractNum>
-  <w:abstractNum w:abstractNumId="10" w15:restartNumberingAfterBreak="0">
+  <w:abstractNum w:abstractNumId="11" w15:restartNumberingAfterBreak="0">
     <w:nsid w:val="0A4A5AED"/>
     <w:multiLevelType w:val="singleLevel"/>
     <w:tmpl w:val="C310EC42"/>
@@ -9056,7 +11746,305 @@
       </w:pPr>
     </w:lvl>
   </w:abstractNum>
-  <w:abstractNum w:abstractNumId="11" w15:restartNumberingAfterBreak="0">
+  <w:abstractNum w:abstractNumId="12" w15:restartNumberingAfterBreak="0">
+    <w:nsid w:val="0B707B6C"/>
+    <w:multiLevelType w:val="multilevel"/>
+    <w:tmpl w:val="3FAAAAF4"/>
+    <w:lvl w:ilvl="0">
+      <w:start w:val="1"/>
+      <w:numFmt w:val="bullet"/>
+      <w:lvlText w:val=""/>
+      <w:lvlJc w:val="left"/>
+      <w:pPr>
+        <w:tabs>
+          <w:tab w:val="num" w:pos="720"/>
+        </w:tabs>
+        <w:ind w:left="720" w:hanging="360"/>
+      </w:pPr>
+      <w:rPr>
+        <w:rFonts w:ascii="Symbol" w:hAnsi="Symbol" w:hint="default"/>
+        <w:sz w:val="20"/>
+      </w:rPr>
+    </w:lvl>
+    <w:lvl w:ilvl="1" w:tentative="1">
+      <w:start w:val="1"/>
+      <w:numFmt w:val="bullet"/>
+      <w:lvlText w:val="o"/>
+      <w:lvlJc w:val="left"/>
+      <w:pPr>
+        <w:tabs>
+          <w:tab w:val="num" w:pos="1440"/>
+        </w:tabs>
+        <w:ind w:left="1440" w:hanging="360"/>
+      </w:pPr>
+      <w:rPr>
+        <w:rFonts w:ascii="Courier New" w:hAnsi="Courier New" w:hint="default"/>
+        <w:sz w:val="20"/>
+      </w:rPr>
+    </w:lvl>
+    <w:lvl w:ilvl="2" w:tentative="1">
+      <w:start w:val="1"/>
+      <w:numFmt w:val="bullet"/>
+      <w:lvlText w:val=""/>
+      <w:lvlJc w:val="left"/>
+      <w:pPr>
+        <w:tabs>
+          <w:tab w:val="num" w:pos="2160"/>
+        </w:tabs>
+        <w:ind w:left="2160" w:hanging="360"/>
+      </w:pPr>
+      <w:rPr>
+        <w:rFonts w:ascii="Wingdings" w:hAnsi="Wingdings" w:hint="default"/>
+        <w:sz w:val="20"/>
+      </w:rPr>
+    </w:lvl>
+    <w:lvl w:ilvl="3" w:tentative="1">
+      <w:start w:val="1"/>
+      <w:numFmt w:val="bullet"/>
+      <w:lvlText w:val=""/>
+      <w:lvlJc w:val="left"/>
+      <w:pPr>
+        <w:tabs>
+          <w:tab w:val="num" w:pos="2880"/>
+        </w:tabs>
+        <w:ind w:left="2880" w:hanging="360"/>
+      </w:pPr>
+      <w:rPr>
+        <w:rFonts w:ascii="Wingdings" w:hAnsi="Wingdings" w:hint="default"/>
+        <w:sz w:val="20"/>
+      </w:rPr>
+    </w:lvl>
+    <w:lvl w:ilvl="4" w:tentative="1">
+      <w:start w:val="1"/>
+      <w:numFmt w:val="bullet"/>
+      <w:lvlText w:val=""/>
+      <w:lvlJc w:val="left"/>
+      <w:pPr>
+        <w:tabs>
+          <w:tab w:val="num" w:pos="3600"/>
+        </w:tabs>
+        <w:ind w:left="3600" w:hanging="360"/>
+      </w:pPr>
+      <w:rPr>
+        <w:rFonts w:ascii="Wingdings" w:hAnsi="Wingdings" w:hint="default"/>
+        <w:sz w:val="20"/>
+      </w:rPr>
+    </w:lvl>
+    <w:lvl w:ilvl="5" w:tentative="1">
+      <w:start w:val="1"/>
+      <w:numFmt w:val="bullet"/>
+      <w:lvlText w:val=""/>
+      <w:lvlJc w:val="left"/>
+      <w:pPr>
+        <w:tabs>
+          <w:tab w:val="num" w:pos="4320"/>
+        </w:tabs>
+        <w:ind w:left="4320" w:hanging="360"/>
+      </w:pPr>
+      <w:rPr>
+        <w:rFonts w:ascii="Wingdings" w:hAnsi="Wingdings" w:hint="default"/>
+        <w:sz w:val="20"/>
+      </w:rPr>
+    </w:lvl>
+    <w:lvl w:ilvl="6" w:tentative="1">
+      <w:start w:val="1"/>
+      <w:numFmt w:val="bullet"/>
+      <w:lvlText w:val=""/>
+      <w:lvlJc w:val="left"/>
+      <w:pPr>
+        <w:tabs>
+          <w:tab w:val="num" w:pos="5040"/>
+        </w:tabs>
+        <w:ind w:left="5040" w:hanging="360"/>
+      </w:pPr>
+      <w:rPr>
+        <w:rFonts w:ascii="Wingdings" w:hAnsi="Wingdings" w:hint="default"/>
+        <w:sz w:val="20"/>
+      </w:rPr>
+    </w:lvl>
+    <w:lvl w:ilvl="7" w:tentative="1">
+      <w:start w:val="1"/>
+      <w:numFmt w:val="bullet"/>
+      <w:lvlText w:val=""/>
+      <w:lvlJc w:val="left"/>
+      <w:pPr>
+        <w:tabs>
+          <w:tab w:val="num" w:pos="5760"/>
+        </w:tabs>
+        <w:ind w:left="5760" w:hanging="360"/>
+      </w:pPr>
+      <w:rPr>
+        <w:rFonts w:ascii="Wingdings" w:hAnsi="Wingdings" w:hint="default"/>
+        <w:sz w:val="20"/>
+      </w:rPr>
+    </w:lvl>
+    <w:lvl w:ilvl="8" w:tentative="1">
+      <w:start w:val="1"/>
+      <w:numFmt w:val="bullet"/>
+      <w:lvlText w:val=""/>
+      <w:lvlJc w:val="left"/>
+      <w:pPr>
+        <w:tabs>
+          <w:tab w:val="num" w:pos="6480"/>
+        </w:tabs>
+        <w:ind w:left="6480" w:hanging="360"/>
+      </w:pPr>
+      <w:rPr>
+        <w:rFonts w:ascii="Wingdings" w:hAnsi="Wingdings" w:hint="default"/>
+        <w:sz w:val="20"/>
+      </w:rPr>
+    </w:lvl>
+  </w:abstractNum>
+  <w:abstractNum w:abstractNumId="13" w15:restartNumberingAfterBreak="0">
+    <w:nsid w:val="1C4E0ED1"/>
+    <w:multiLevelType w:val="multilevel"/>
+    <w:tmpl w:val="1DF45D66"/>
+    <w:lvl w:ilvl="0">
+      <w:start w:val="1"/>
+      <w:numFmt w:val="bullet"/>
+      <w:lvlText w:val=""/>
+      <w:lvlJc w:val="left"/>
+      <w:pPr>
+        <w:tabs>
+          <w:tab w:val="num" w:pos="720"/>
+        </w:tabs>
+        <w:ind w:left="720" w:hanging="360"/>
+      </w:pPr>
+      <w:rPr>
+        <w:rFonts w:ascii="Symbol" w:hAnsi="Symbol" w:hint="default"/>
+        <w:sz w:val="20"/>
+      </w:rPr>
+    </w:lvl>
+    <w:lvl w:ilvl="1" w:tentative="1">
+      <w:start w:val="1"/>
+      <w:numFmt w:val="bullet"/>
+      <w:lvlText w:val="o"/>
+      <w:lvlJc w:val="left"/>
+      <w:pPr>
+        <w:tabs>
+          <w:tab w:val="num" w:pos="1440"/>
+        </w:tabs>
+        <w:ind w:left="1440" w:hanging="360"/>
+      </w:pPr>
+      <w:rPr>
+        <w:rFonts w:ascii="Courier New" w:hAnsi="Courier New" w:hint="default"/>
+        <w:sz w:val="20"/>
+      </w:rPr>
+    </w:lvl>
+    <w:lvl w:ilvl="2" w:tentative="1">
+      <w:start w:val="1"/>
+      <w:numFmt w:val="bullet"/>
+      <w:lvlText w:val=""/>
+      <w:lvlJc w:val="left"/>
+      <w:pPr>
+        <w:tabs>
+          <w:tab w:val="num" w:pos="2160"/>
+        </w:tabs>
+        <w:ind w:left="2160" w:hanging="360"/>
+      </w:pPr>
+      <w:rPr>
+        <w:rFonts w:ascii="Wingdings" w:hAnsi="Wingdings" w:hint="default"/>
+        <w:sz w:val="20"/>
+      </w:rPr>
+    </w:lvl>
+    <w:lvl w:ilvl="3" w:tentative="1">
+      <w:start w:val="1"/>
+      <w:numFmt w:val="bullet"/>
+      <w:lvlText w:val=""/>
+      <w:lvlJc w:val="left"/>
+      <w:pPr>
+        <w:tabs>
+          <w:tab w:val="num" w:pos="2880"/>
+        </w:tabs>
+        <w:ind w:left="2880" w:hanging="360"/>
+      </w:pPr>
+      <w:rPr>
+        <w:rFonts w:ascii="Wingdings" w:hAnsi="Wingdings" w:hint="default"/>
+        <w:sz w:val="20"/>
+      </w:rPr>
+    </w:lvl>
+    <w:lvl w:ilvl="4" w:tentative="1">
+      <w:start w:val="1"/>
+      <w:numFmt w:val="bullet"/>
+      <w:lvlText w:val=""/>
+      <w:lvlJc w:val="left"/>
+      <w:pPr>
+        <w:tabs>
+          <w:tab w:val="num" w:pos="3600"/>
+        </w:tabs>
+        <w:ind w:left="3600" w:hanging="360"/>
+      </w:pPr>
+      <w:rPr>
+        <w:rFonts w:ascii="Wingdings" w:hAnsi="Wingdings" w:hint="default"/>
+        <w:sz w:val="20"/>
+      </w:rPr>
+    </w:lvl>
+    <w:lvl w:ilvl="5" w:tentative="1">
+      <w:start w:val="1"/>
+      <w:numFmt w:val="bullet"/>
+      <w:lvlText w:val=""/>
+      <w:lvlJc w:val="left"/>
+      <w:pPr>
+        <w:tabs>
+          <w:tab w:val="num" w:pos="4320"/>
+        </w:tabs>
+        <w:ind w:left="4320" w:hanging="360"/>
+      </w:pPr>
+      <w:rPr>
+        <w:rFonts w:ascii="Wingdings" w:hAnsi="Wingdings" w:hint="default"/>
+        <w:sz w:val="20"/>
+      </w:rPr>
+    </w:lvl>
+    <w:lvl w:ilvl="6" w:tentative="1">
+      <w:start w:val="1"/>
+      <w:numFmt w:val="bullet"/>
+      <w:lvlText w:val=""/>
+      <w:lvlJc w:val="left"/>
+      <w:pPr>
+        <w:tabs>
+          <w:tab w:val="num" w:pos="5040"/>
+        </w:tabs>
+        <w:ind w:left="5040" w:hanging="360"/>
+      </w:pPr>
+      <w:rPr>
+        <w:rFonts w:ascii="Wingdings" w:hAnsi="Wingdings" w:hint="default"/>
+        <w:sz w:val="20"/>
+      </w:rPr>
+    </w:lvl>
+    <w:lvl w:ilvl="7" w:tentative="1">
+      <w:start w:val="1"/>
+      <w:numFmt w:val="bullet"/>
+      <w:lvlText w:val=""/>
+      <w:lvlJc w:val="left"/>
+      <w:pPr>
+        <w:tabs>
+          <w:tab w:val="num" w:pos="5760"/>
+        </w:tabs>
+        <w:ind w:left="5760" w:hanging="360"/>
+      </w:pPr>
+      <w:rPr>
+        <w:rFonts w:ascii="Wingdings" w:hAnsi="Wingdings" w:hint="default"/>
+        <w:sz w:val="20"/>
+      </w:rPr>
+    </w:lvl>
+    <w:lvl w:ilvl="8" w:tentative="1">
+      <w:start w:val="1"/>
+      <w:numFmt w:val="bullet"/>
+      <w:lvlText w:val=""/>
+      <w:lvlJc w:val="left"/>
+      <w:pPr>
+        <w:tabs>
+          <w:tab w:val="num" w:pos="6480"/>
+        </w:tabs>
+        <w:ind w:left="6480" w:hanging="360"/>
+      </w:pPr>
+      <w:rPr>
+        <w:rFonts w:ascii="Wingdings" w:hAnsi="Wingdings" w:hint="default"/>
+        <w:sz w:val="20"/>
+      </w:rPr>
+    </w:lvl>
+  </w:abstractNum>
+  <w:abstractNum w:abstractNumId="14" w15:restartNumberingAfterBreak="0">
     <w:nsid w:val="1F651DA6"/>
     <w:multiLevelType w:val="hybridMultilevel"/>
     <w:tmpl w:val="86FE6162"/>
@@ -9169,7 +12157,305 @@
       </w:rPr>
     </w:lvl>
   </w:abstractNum>
-  <w:abstractNum w:abstractNumId="12" w15:restartNumberingAfterBreak="0">
+  <w:abstractNum w:abstractNumId="15" w15:restartNumberingAfterBreak="0">
+    <w:nsid w:val="257E7958"/>
+    <w:multiLevelType w:val="multilevel"/>
+    <w:tmpl w:val="0A72FA1A"/>
+    <w:lvl w:ilvl="0">
+      <w:start w:val="1"/>
+      <w:numFmt w:val="bullet"/>
+      <w:lvlText w:val=""/>
+      <w:lvlJc w:val="left"/>
+      <w:pPr>
+        <w:tabs>
+          <w:tab w:val="num" w:pos="720"/>
+        </w:tabs>
+        <w:ind w:left="720" w:hanging="360"/>
+      </w:pPr>
+      <w:rPr>
+        <w:rFonts w:ascii="Symbol" w:hAnsi="Symbol" w:hint="default"/>
+        <w:sz w:val="20"/>
+      </w:rPr>
+    </w:lvl>
+    <w:lvl w:ilvl="1" w:tentative="1">
+      <w:start w:val="1"/>
+      <w:numFmt w:val="bullet"/>
+      <w:lvlText w:val="o"/>
+      <w:lvlJc w:val="left"/>
+      <w:pPr>
+        <w:tabs>
+          <w:tab w:val="num" w:pos="1440"/>
+        </w:tabs>
+        <w:ind w:left="1440" w:hanging="360"/>
+      </w:pPr>
+      <w:rPr>
+        <w:rFonts w:ascii="Courier New" w:hAnsi="Courier New" w:hint="default"/>
+        <w:sz w:val="20"/>
+      </w:rPr>
+    </w:lvl>
+    <w:lvl w:ilvl="2" w:tentative="1">
+      <w:start w:val="1"/>
+      <w:numFmt w:val="bullet"/>
+      <w:lvlText w:val=""/>
+      <w:lvlJc w:val="left"/>
+      <w:pPr>
+        <w:tabs>
+          <w:tab w:val="num" w:pos="2160"/>
+        </w:tabs>
+        <w:ind w:left="2160" w:hanging="360"/>
+      </w:pPr>
+      <w:rPr>
+        <w:rFonts w:ascii="Wingdings" w:hAnsi="Wingdings" w:hint="default"/>
+        <w:sz w:val="20"/>
+      </w:rPr>
+    </w:lvl>
+    <w:lvl w:ilvl="3" w:tentative="1">
+      <w:start w:val="1"/>
+      <w:numFmt w:val="bullet"/>
+      <w:lvlText w:val=""/>
+      <w:lvlJc w:val="left"/>
+      <w:pPr>
+        <w:tabs>
+          <w:tab w:val="num" w:pos="2880"/>
+        </w:tabs>
+        <w:ind w:left="2880" w:hanging="360"/>
+      </w:pPr>
+      <w:rPr>
+        <w:rFonts w:ascii="Wingdings" w:hAnsi="Wingdings" w:hint="default"/>
+        <w:sz w:val="20"/>
+      </w:rPr>
+    </w:lvl>
+    <w:lvl w:ilvl="4" w:tentative="1">
+      <w:start w:val="1"/>
+      <w:numFmt w:val="bullet"/>
+      <w:lvlText w:val=""/>
+      <w:lvlJc w:val="left"/>
+      <w:pPr>
+        <w:tabs>
+          <w:tab w:val="num" w:pos="3600"/>
+        </w:tabs>
+        <w:ind w:left="3600" w:hanging="360"/>
+      </w:pPr>
+      <w:rPr>
+        <w:rFonts w:ascii="Wingdings" w:hAnsi="Wingdings" w:hint="default"/>
+        <w:sz w:val="20"/>
+      </w:rPr>
+    </w:lvl>
+    <w:lvl w:ilvl="5" w:tentative="1">
+      <w:start w:val="1"/>
+      <w:numFmt w:val="bullet"/>
+      <w:lvlText w:val=""/>
+      <w:lvlJc w:val="left"/>
+      <w:pPr>
+        <w:tabs>
+          <w:tab w:val="num" w:pos="4320"/>
+        </w:tabs>
+        <w:ind w:left="4320" w:hanging="360"/>
+      </w:pPr>
+      <w:rPr>
+        <w:rFonts w:ascii="Wingdings" w:hAnsi="Wingdings" w:hint="default"/>
+        <w:sz w:val="20"/>
+      </w:rPr>
+    </w:lvl>
+    <w:lvl w:ilvl="6" w:tentative="1">
+      <w:start w:val="1"/>
+      <w:numFmt w:val="bullet"/>
+      <w:lvlText w:val=""/>
+      <w:lvlJc w:val="left"/>
+      <w:pPr>
+        <w:tabs>
+          <w:tab w:val="num" w:pos="5040"/>
+        </w:tabs>
+        <w:ind w:left="5040" w:hanging="360"/>
+      </w:pPr>
+      <w:rPr>
+        <w:rFonts w:ascii="Wingdings" w:hAnsi="Wingdings" w:hint="default"/>
+        <w:sz w:val="20"/>
+      </w:rPr>
+    </w:lvl>
+    <w:lvl w:ilvl="7" w:tentative="1">
+      <w:start w:val="1"/>
+      <w:numFmt w:val="bullet"/>
+      <w:lvlText w:val=""/>
+      <w:lvlJc w:val="left"/>
+      <w:pPr>
+        <w:tabs>
+          <w:tab w:val="num" w:pos="5760"/>
+        </w:tabs>
+        <w:ind w:left="5760" w:hanging="360"/>
+      </w:pPr>
+      <w:rPr>
+        <w:rFonts w:ascii="Wingdings" w:hAnsi="Wingdings" w:hint="default"/>
+        <w:sz w:val="20"/>
+      </w:rPr>
+    </w:lvl>
+    <w:lvl w:ilvl="8" w:tentative="1">
+      <w:start w:val="1"/>
+      <w:numFmt w:val="bullet"/>
+      <w:lvlText w:val=""/>
+      <w:lvlJc w:val="left"/>
+      <w:pPr>
+        <w:tabs>
+          <w:tab w:val="num" w:pos="6480"/>
+        </w:tabs>
+        <w:ind w:left="6480" w:hanging="360"/>
+      </w:pPr>
+      <w:rPr>
+        <w:rFonts w:ascii="Wingdings" w:hAnsi="Wingdings" w:hint="default"/>
+        <w:sz w:val="20"/>
+      </w:rPr>
+    </w:lvl>
+  </w:abstractNum>
+  <w:abstractNum w:abstractNumId="16" w15:restartNumberingAfterBreak="0">
+    <w:nsid w:val="53C7380D"/>
+    <w:multiLevelType w:val="multilevel"/>
+    <w:tmpl w:val="F462F2E0"/>
+    <w:lvl w:ilvl="0">
+      <w:start w:val="1"/>
+      <w:numFmt w:val="bullet"/>
+      <w:lvlText w:val=""/>
+      <w:lvlJc w:val="left"/>
+      <w:pPr>
+        <w:tabs>
+          <w:tab w:val="num" w:pos="720"/>
+        </w:tabs>
+        <w:ind w:left="720" w:hanging="360"/>
+      </w:pPr>
+      <w:rPr>
+        <w:rFonts w:ascii="Symbol" w:hAnsi="Symbol" w:hint="default"/>
+        <w:sz w:val="20"/>
+      </w:rPr>
+    </w:lvl>
+    <w:lvl w:ilvl="1" w:tentative="1">
+      <w:start w:val="1"/>
+      <w:numFmt w:val="bullet"/>
+      <w:lvlText w:val="o"/>
+      <w:lvlJc w:val="left"/>
+      <w:pPr>
+        <w:tabs>
+          <w:tab w:val="num" w:pos="1440"/>
+        </w:tabs>
+        <w:ind w:left="1440" w:hanging="360"/>
+      </w:pPr>
+      <w:rPr>
+        <w:rFonts w:ascii="Courier New" w:hAnsi="Courier New" w:hint="default"/>
+        <w:sz w:val="20"/>
+      </w:rPr>
+    </w:lvl>
+    <w:lvl w:ilvl="2" w:tentative="1">
+      <w:start w:val="1"/>
+      <w:numFmt w:val="bullet"/>
+      <w:lvlText w:val=""/>
+      <w:lvlJc w:val="left"/>
+      <w:pPr>
+        <w:tabs>
+          <w:tab w:val="num" w:pos="2160"/>
+        </w:tabs>
+        <w:ind w:left="2160" w:hanging="360"/>
+      </w:pPr>
+      <w:rPr>
+        <w:rFonts w:ascii="Wingdings" w:hAnsi="Wingdings" w:hint="default"/>
+        <w:sz w:val="20"/>
+      </w:rPr>
+    </w:lvl>
+    <w:lvl w:ilvl="3" w:tentative="1">
+      <w:start w:val="1"/>
+      <w:numFmt w:val="bullet"/>
+      <w:lvlText w:val=""/>
+      <w:lvlJc w:val="left"/>
+      <w:pPr>
+        <w:tabs>
+          <w:tab w:val="num" w:pos="2880"/>
+        </w:tabs>
+        <w:ind w:left="2880" w:hanging="360"/>
+      </w:pPr>
+      <w:rPr>
+        <w:rFonts w:ascii="Wingdings" w:hAnsi="Wingdings" w:hint="default"/>
+        <w:sz w:val="20"/>
+      </w:rPr>
+    </w:lvl>
+    <w:lvl w:ilvl="4" w:tentative="1">
+      <w:start w:val="1"/>
+      <w:numFmt w:val="bullet"/>
+      <w:lvlText w:val=""/>
+      <w:lvlJc w:val="left"/>
+      <w:pPr>
+        <w:tabs>
+          <w:tab w:val="num" w:pos="3600"/>
+        </w:tabs>
+        <w:ind w:left="3600" w:hanging="360"/>
+      </w:pPr>
+      <w:rPr>
+        <w:rFonts w:ascii="Wingdings" w:hAnsi="Wingdings" w:hint="default"/>
+        <w:sz w:val="20"/>
+      </w:rPr>
+    </w:lvl>
+    <w:lvl w:ilvl="5" w:tentative="1">
+      <w:start w:val="1"/>
+      <w:numFmt w:val="bullet"/>
+      <w:lvlText w:val=""/>
+      <w:lvlJc w:val="left"/>
+      <w:pPr>
+        <w:tabs>
+          <w:tab w:val="num" w:pos="4320"/>
+        </w:tabs>
+        <w:ind w:left="4320" w:hanging="360"/>
+      </w:pPr>
+      <w:rPr>
+        <w:rFonts w:ascii="Wingdings" w:hAnsi="Wingdings" w:hint="default"/>
+        <w:sz w:val="20"/>
+      </w:rPr>
+    </w:lvl>
+    <w:lvl w:ilvl="6" w:tentative="1">
+      <w:start w:val="1"/>
+      <w:numFmt w:val="bullet"/>
+      <w:lvlText w:val=""/>
+      <w:lvlJc w:val="left"/>
+      <w:pPr>
+        <w:tabs>
+          <w:tab w:val="num" w:pos="5040"/>
+        </w:tabs>
+        <w:ind w:left="5040" w:hanging="360"/>
+      </w:pPr>
+      <w:rPr>
+        <w:rFonts w:ascii="Wingdings" w:hAnsi="Wingdings" w:hint="default"/>
+        <w:sz w:val="20"/>
+      </w:rPr>
+    </w:lvl>
+    <w:lvl w:ilvl="7" w:tentative="1">
+      <w:start w:val="1"/>
+      <w:numFmt w:val="bullet"/>
+      <w:lvlText w:val=""/>
+      <w:lvlJc w:val="left"/>
+      <w:pPr>
+        <w:tabs>
+          <w:tab w:val="num" w:pos="5760"/>
+        </w:tabs>
+        <w:ind w:left="5760" w:hanging="360"/>
+      </w:pPr>
+      <w:rPr>
+        <w:rFonts w:ascii="Wingdings" w:hAnsi="Wingdings" w:hint="default"/>
+        <w:sz w:val="20"/>
+      </w:rPr>
+    </w:lvl>
+    <w:lvl w:ilvl="8" w:tentative="1">
+      <w:start w:val="1"/>
+      <w:numFmt w:val="bullet"/>
+      <w:lvlText w:val=""/>
+      <w:lvlJc w:val="left"/>
+      <w:pPr>
+        <w:tabs>
+          <w:tab w:val="num" w:pos="6480"/>
+        </w:tabs>
+        <w:ind w:left="6480" w:hanging="360"/>
+      </w:pPr>
+      <w:rPr>
+        <w:rFonts w:ascii="Wingdings" w:hAnsi="Wingdings" w:hint="default"/>
+        <w:sz w:val="20"/>
+      </w:rPr>
+    </w:lvl>
+  </w:abstractNum>
+  <w:abstractNum w:abstractNumId="17" w15:restartNumberingAfterBreak="0">
     <w:nsid w:val="6F3B07C1"/>
     <w:multiLevelType w:val="multilevel"/>
     <w:tmpl w:val="523E86BC"/>
@@ -9307,7 +12593,7 @@
     <w:abstractNumId w:val="0"/>
   </w:num>
   <w:num w:numId="9" w16cid:durableId="2007245708">
-    <w:abstractNumId w:val="10"/>
+    <w:abstractNumId w:val="11"/>
   </w:num>
   <w:num w:numId="10" w16cid:durableId="373777330">
     <w:abstractNumId w:val="8"/>
@@ -9316,12 +12602,27 @@
     <w:abstractNumId w:val="8"/>
   </w:num>
   <w:num w:numId="12" w16cid:durableId="1878539721">
+    <w:abstractNumId w:val="10"/>
+  </w:num>
+  <w:num w:numId="13" w16cid:durableId="901139214">
+    <w:abstractNumId w:val="14"/>
+  </w:num>
+  <w:num w:numId="14" w16cid:durableId="629214050">
+    <w:abstractNumId w:val="17"/>
+  </w:num>
+  <w:num w:numId="15" w16cid:durableId="45640884">
+    <w:abstractNumId w:val="16"/>
+  </w:num>
+  <w:num w:numId="16" w16cid:durableId="592128257">
     <w:abstractNumId w:val="9"/>
   </w:num>
-  <w:num w:numId="13" w16cid:durableId="901139214">
-    <w:abstractNumId w:val="11"/>
+  <w:num w:numId="17" w16cid:durableId="712002191">
+    <w:abstractNumId w:val="15"/>
   </w:num>
-  <w:num w:numId="14" w16cid:durableId="629214050">
+  <w:num w:numId="18" w16cid:durableId="1118833379">
+    <w:abstractNumId w:val="13"/>
+  </w:num>
+  <w:num w:numId="19" w16cid:durableId="12923124">
     <w:abstractNumId w:val="12"/>
   </w:num>
 </w:numbering>
@@ -20635,6 +23936,18 @@
       <w:ind w:left="440"/>
     </w:pPr>
   </w:style>
+  <w:style w:type="character" w:styleId="UnresolvedMention">
+    <w:name w:val="Unresolved Mention"/>
+    <w:basedOn w:val="DefaultParagraphFont"/>
+    <w:uiPriority w:val="99"/>
+    <w:semiHidden/>
+    <w:unhideWhenUsed/>
+    <w:rsid w:val="00A645CC"/>
+    <w:rPr>
+      <w:color w:val="605E5C"/>
+      <w:shd w:val="clear" w:color="auto" w:fill="E1DFDD"/>
+    </w:rPr>
+  </w:style>
 </w:styles>
 </file>
 

</xml_diff>